<commit_message>
Feat:Time & Attendance Tracking at Register Terminal & logistics fix
</commit_message>
<xml_diff>
--- a/Attachment/CIT_Attachment-Logbook.docx
+++ b/Attachment/CIT_Attachment-Logbook.docx
@@ -146,7 +146,27 @@
               <w:sz w:val="22"/>
               <w:szCs w:val="22"/>
             </w:rPr>
-            <w:t xml:space="preserve">P.O. Box 15653 - 00503, Mbagathi, Nairobi Tel: +254 020 2071391, </w:t>
+            <w:t xml:space="preserve">P.O. Box 15653 - 00503, </w:t>
+          </w:r>
+          <w:proofErr w:type="spellStart"/>
+          <w:r>
+            <w:rPr>
+              <w:rFonts w:ascii="Arial" w:eastAsia="Calibri" w:hAnsi="Arial" w:cs="Arial"/>
+              <w:color w:val="0000FF"/>
+              <w:sz w:val="22"/>
+              <w:szCs w:val="22"/>
+            </w:rPr>
+            <w:t>Mbagathi</w:t>
+          </w:r>
+          <w:proofErr w:type="spellEnd"/>
+          <w:r>
+            <w:rPr>
+              <w:rFonts w:ascii="Arial" w:eastAsia="Calibri" w:hAnsi="Arial" w:cs="Arial"/>
+              <w:color w:val="0000FF"/>
+              <w:sz w:val="22"/>
+              <w:szCs w:val="22"/>
+            </w:rPr>
+            <w:t xml:space="preserve">, Nairobi Tel: +254 020 2071391, </w:t>
           </w:r>
         </w:p>
         <w:p>
@@ -838,7 +858,25 @@
               <w:sz w:val="24"/>
               <w:szCs w:val="24"/>
             </w:rPr>
-            <w:t>His/her application for change of place of attachment should indicate the name and the address (not just Post Office Box) of the company or industry to which he/she wishes to transfer. Any attachment not properly authorized will be cancelled.</w:t>
+            <w:t xml:space="preserve">His/her application for change of place of attachment should indicate the name and the address (not just </w:t>
+          </w:r>
+          <w:proofErr w:type="gramStart"/>
+          <w:r>
+            <w:rPr>
+              <w:rFonts w:ascii="Times New Roman" w:hAnsi="Times New Roman" w:cs="Times New Roman"/>
+              <w:sz w:val="24"/>
+              <w:szCs w:val="24"/>
+            </w:rPr>
+            <w:t>Post Office</w:t>
+          </w:r>
+          <w:proofErr w:type="gramEnd"/>
+          <w:r>
+            <w:rPr>
+              <w:rFonts w:ascii="Times New Roman" w:hAnsi="Times New Roman" w:cs="Times New Roman"/>
+              <w:sz w:val="24"/>
+              <w:szCs w:val="24"/>
+            </w:rPr>
+            <w:t xml:space="preserve"> Box) of the company or industry to which he/she wishes to transfer. Any attachment not properly authorized will be cancelled.</w:t>
           </w:r>
         </w:p>
         <w:p>
@@ -1041,7 +1079,25 @@
               <w:sz w:val="24"/>
               <w:szCs w:val="24"/>
             </w:rPr>
-            <w:t>problems encountered and areas of improvement that the university needs to address to add value and relevance to the programme being undertaken by the student. The report should contain a summary of activities of the organization and processes the student was involved in.</w:t>
+            <w:t xml:space="preserve">problems encountered and areas of improvement that the university needs to address to add value and relevance to the </w:t>
+          </w:r>
+          <w:proofErr w:type="spellStart"/>
+          <w:r>
+            <w:rPr>
+              <w:rFonts w:ascii="Times New Roman" w:hAnsi="Times New Roman" w:cs="Times New Roman"/>
+              <w:sz w:val="24"/>
+              <w:szCs w:val="24"/>
+            </w:rPr>
+            <w:t>programme</w:t>
+          </w:r>
+          <w:proofErr w:type="spellEnd"/>
+          <w:r>
+            <w:rPr>
+              <w:rFonts w:ascii="Times New Roman" w:hAnsi="Times New Roman" w:cs="Times New Roman"/>
+              <w:sz w:val="24"/>
+              <w:szCs w:val="24"/>
+            </w:rPr>
+            <w:t xml:space="preserve"> being undertaken by the student. The report should contain a summary of activities of the organization and processes the student was involved in.</w:t>
           </w:r>
         </w:p>
         <w:p>
@@ -1644,7 +1700,23 @@
           </w:tcPr>
           <w:p>
             <w:r>
-              <w:t>I reported for orientation at OpenFloat HQ, met my field supervisor, initialized the local development environment (Node.js, Express, SQLite), and configured the project Git version control repository (SyncAlly/Open-Float-POS).</w:t>
+              <w:t xml:space="preserve">I reported for orientation at </w:t>
+            </w:r>
+            <w:proofErr w:type="spellStart"/>
+            <w:r>
+              <w:t>OpenFloat</w:t>
+            </w:r>
+            <w:proofErr w:type="spellEnd"/>
+            <w:r>
+              <w:t xml:space="preserve"> HQ, met my field supervisor, initialized the local development environment (Node.js, Express, SQLite), and configured the project Git version control repository (</w:t>
+            </w:r>
+            <w:proofErr w:type="spellStart"/>
+            <w:r>
+              <w:t>SyncAlly</w:t>
+            </w:r>
+            <w:proofErr w:type="spellEnd"/>
+            <w:r>
+              <w:t>/Open-Float-POS).</w:t>
             </w:r>
           </w:p>
         </w:tc>
@@ -1752,7 +1824,15 @@
           </w:tcPr>
           <w:p>
             <w:r>
-              <w:t>I designed the core relational database schema (backend/db/database.js) in SQLite, defining tables for users, branches, product categories, inventory items, and customer profiles with proper foreign key constraints.</w:t>
+              <w:t>I designed the core relational database schema (backend/</w:t>
+            </w:r>
+            <w:proofErr w:type="spellStart"/>
+            <w:r>
+              <w:t>db</w:t>
+            </w:r>
+            <w:proofErr w:type="spellEnd"/>
+            <w:r>
+              <w:t>/database.js) in SQLite, defining tables for users, branches, product categories, inventory items, and customer profiles with proper foreign key constraints.</w:t>
             </w:r>
           </w:p>
         </w:tc>
@@ -1867,7 +1947,23 @@
           </w:tcPr>
           <w:p>
             <w:r>
-              <w:t>I implemented the Node.js Express API server engine (backend/server.js), created authentication middleware (requireAuth), and wrote the user authentication controller for login and credential validation (POST /api/auth/login).</w:t>
+              <w:t>I implemented the Node.js Express API server engine (backend/server.js), created authentication middleware (</w:t>
+            </w:r>
+            <w:proofErr w:type="spellStart"/>
+            <w:r>
+              <w:t>requireAuth</w:t>
+            </w:r>
+            <w:proofErr w:type="spellEnd"/>
+            <w:r>
+              <w:t>), and wrote the user authentication controller for login and credential validation (POST /</w:t>
+            </w:r>
+            <w:proofErr w:type="spellStart"/>
+            <w:r>
+              <w:t>api</w:t>
+            </w:r>
+            <w:proofErr w:type="spellEnd"/>
+            <w:r>
+              <w:t>/auth/login).</w:t>
             </w:r>
           </w:p>
         </w:tc>
@@ -1975,7 +2071,23 @@
           </w:tcPr>
           <w:p>
             <w:r>
-              <w:t>I built the Single Page Application (SPA) foundation in index.html and css/style.css, establishing the modern design tokens, CSS variables, glassmorphic UI components, and universal single login interface.</w:t>
+              <w:t xml:space="preserve">I built the Single Page Application (SPA) foundation in index.html and </w:t>
+            </w:r>
+            <w:proofErr w:type="spellStart"/>
+            <w:r>
+              <w:t>css</w:t>
+            </w:r>
+            <w:proofErr w:type="spellEnd"/>
+            <w:r>
+              <w:t xml:space="preserve">/style.css, establishing the modern design tokens, CSS variables, </w:t>
+            </w:r>
+            <w:proofErr w:type="spellStart"/>
+            <w:r>
+              <w:t>glassmorphic</w:t>
+            </w:r>
+            <w:proofErr w:type="spellEnd"/>
+            <w:r>
+              <w:t xml:space="preserve"> UI components, and universal single login interface.</w:t>
             </w:r>
           </w:p>
         </w:tc>
@@ -2077,7 +2189,57 @@
           </w:tcPr>
           <w:p>
             <w:r>
-              <w:t>I created the frontend state management engine and view router in js/app.js (navTo(), checkSession()), enabling persistent user sessions via localStorage and dynamic topbar user profile indicators.</w:t>
+              <w:t xml:space="preserve">I created the frontend state management engine and view router in </w:t>
+            </w:r>
+            <w:proofErr w:type="spellStart"/>
+            <w:r>
+              <w:t>js</w:t>
+            </w:r>
+            <w:proofErr w:type="spellEnd"/>
+            <w:r>
+              <w:t>/app.js (</w:t>
+            </w:r>
+            <w:proofErr w:type="spellStart"/>
+            <w:proofErr w:type="gramStart"/>
+            <w:r>
+              <w:t>navTo</w:t>
+            </w:r>
+            <w:proofErr w:type="spellEnd"/>
+            <w:r>
+              <w:t>(</w:t>
+            </w:r>
+            <w:proofErr w:type="gramEnd"/>
+            <w:r>
+              <w:t xml:space="preserve">), </w:t>
+            </w:r>
+            <w:proofErr w:type="spellStart"/>
+            <w:proofErr w:type="gramStart"/>
+            <w:r>
+              <w:t>checkSession</w:t>
+            </w:r>
+            <w:proofErr w:type="spellEnd"/>
+            <w:r>
+              <w:t>(</w:t>
+            </w:r>
+            <w:proofErr w:type="gramEnd"/>
+            <w:r>
+              <w:t xml:space="preserve">)), enabling persistent user sessions via </w:t>
+            </w:r>
+            <w:proofErr w:type="spellStart"/>
+            <w:r>
+              <w:t>localStorage</w:t>
+            </w:r>
+            <w:proofErr w:type="spellEnd"/>
+            <w:r>
+              <w:t xml:space="preserve"> and dynamic </w:t>
+            </w:r>
+            <w:proofErr w:type="spellStart"/>
+            <w:r>
+              <w:t>topbar</w:t>
+            </w:r>
+            <w:proofErr w:type="spellEnd"/>
+            <w:r>
+              <w:t xml:space="preserve"> user profile indicators.</w:t>
             </w:r>
           </w:p>
         </w:tc>
@@ -2191,7 +2353,11 @@
               <w:right w:val="single" w:sz="5" w:space="0" w:color="000000"/>
             </w:tcBorders>
           </w:tcPr>
-          <w:p/>
+          <w:p>
+            <w:r>
+              <w:t>I performed code bug checks on SQLite database connection initialization, verified JWT token generation edge cases, and wrote unit test scripts for user authentication.</w:t>
+            </w:r>
+          </w:p>
         </w:tc>
         <w:tc>
           <w:tcPr>
@@ -2215,7 +2381,11 @@
               <w:right w:val="single" w:sz="5" w:space="0" w:color="000000"/>
             </w:tcBorders>
           </w:tcPr>
-          <w:p/>
+          <w:p>
+            <w:r>
+              <w:t>Thorough testing on database initialization confirmed the backend was stable for frontend integration.</w:t>
+            </w:r>
+          </w:p>
         </w:tc>
       </w:tr>
     </w:tbl>
@@ -2663,15 +2833,891 @@
           <w:sz w:val="22"/>
           <w:szCs w:val="22"/>
         </w:rPr>
+        <w:t>…</w:t>
+      </w:r>
+      <w:proofErr w:type="gramStart"/>
+      <w:r>
+        <w:rPr>
+          <w:rFonts w:ascii="Arial" w:eastAsia="Arial" w:hAnsi="Arial" w:cs="Arial"/>
+          <w:sz w:val="22"/>
+          <w:szCs w:val="22"/>
+        </w:rPr>
+        <w:t>…</w:t>
+      </w:r>
+      <w:r>
+        <w:rPr>
+          <w:rFonts w:ascii="Arial" w:eastAsia="Arial" w:hAnsi="Arial" w:cs="Arial"/>
+          <w:spacing w:val="-1"/>
+          <w:sz w:val="22"/>
+          <w:szCs w:val="22"/>
+        </w:rPr>
+        <w:t>.</w:t>
+      </w:r>
+      <w:r>
+        <w:rPr>
+          <w:rFonts w:ascii="Arial" w:eastAsia="Arial" w:hAnsi="Arial" w:cs="Arial"/>
+          <w:sz w:val="22"/>
+          <w:szCs w:val="22"/>
+        </w:rPr>
+        <w:t>.</w:t>
+      </w:r>
+      <w:proofErr w:type="gramEnd"/>
+    </w:p>
+    <w:p>
+      <w:pPr>
+        <w:spacing w:before="24"/>
+        <w:ind w:left="600"/>
+        <w:rPr>
+          <w:rFonts w:ascii="Arial" w:eastAsia="Arial" w:hAnsi="Arial" w:cs="Arial"/>
+          <w:b/>
+          <w:sz w:val="22"/>
+          <w:szCs w:val="22"/>
+        </w:rPr>
+      </w:pPr>
+      <w:r>
+        <w:rPr>
+          <w:rFonts w:ascii="Arial" w:eastAsia="Arial" w:hAnsi="Arial" w:cs="Arial"/>
+          <w:b/>
+          <w:sz w:val="22"/>
+          <w:szCs w:val="22"/>
+        </w:rPr>
+        <w:t xml:space="preserve">STUDENT’S WEEKLY </w:t>
+      </w:r>
+      <w:r>
+        <w:rPr>
+          <w:rFonts w:ascii="Arial" w:eastAsia="Arial" w:hAnsi="Arial" w:cs="Arial"/>
+          <w:b/>
+          <w:sz w:val="22"/>
+          <w:szCs w:val="22"/>
+        </w:rPr>
+        <w:t>REPORT (</w:t>
+      </w:r>
+      <w:r>
+        <w:rPr>
+          <w:rFonts w:ascii="Arial" w:eastAsia="Arial" w:hAnsi="Arial" w:cs="Arial"/>
+          <w:b/>
+          <w:sz w:val="22"/>
+          <w:szCs w:val="22"/>
+        </w:rPr>
+        <w:t>WEEK 1)</w:t>
+      </w:r>
+    </w:p>
+    <w:p>
+      <w:pPr>
+        <w:spacing w:before="24"/>
+        <w:ind w:left="600"/>
+        <w:rPr>
+          <w:rFonts w:ascii="Arial" w:eastAsia="Arial" w:hAnsi="Arial" w:cs="Arial"/>
+          <w:b/>
+          <w:sz w:val="22"/>
+          <w:szCs w:val="22"/>
+        </w:rPr>
+      </w:pPr>
+    </w:p>
+    <w:p>
+      <w:pPr>
+        <w:spacing w:before="24"/>
+        <w:ind w:left="600"/>
+        <w:rPr>
+          <w:rFonts w:ascii="Arial" w:eastAsia="Arial" w:hAnsi="Arial" w:cs="Arial"/>
+          <w:b/>
+          <w:sz w:val="22"/>
+          <w:szCs w:val="22"/>
+        </w:rPr>
+      </w:pPr>
+    </w:p>
+    <w:p>
+      <w:pPr>
+        <w:spacing w:before="24"/>
+        <w:ind w:left="600"/>
+        <w:rPr>
+          <w:rFonts w:ascii="Arial" w:eastAsia="Arial" w:hAnsi="Arial" w:cs="Arial"/>
+          <w:b/>
+          <w:sz w:val="22"/>
+          <w:szCs w:val="22"/>
+        </w:rPr>
+      </w:pPr>
+    </w:p>
+    <w:p>
+      <w:pPr>
+        <w:spacing w:before="24"/>
+        <w:ind w:left="600"/>
+        <w:rPr>
+          <w:rFonts w:ascii="Arial" w:eastAsia="Arial" w:hAnsi="Arial" w:cs="Arial"/>
+          <w:b/>
+          <w:sz w:val="22"/>
+          <w:szCs w:val="22"/>
+        </w:rPr>
+      </w:pPr>
+    </w:p>
+    <w:p>
+      <w:pPr>
+        <w:spacing w:before="24"/>
+        <w:ind w:left="600"/>
+        <w:rPr>
+          <w:rFonts w:ascii="Arial" w:eastAsia="Arial" w:hAnsi="Arial" w:cs="Arial"/>
+          <w:b/>
+          <w:sz w:val="22"/>
+          <w:szCs w:val="22"/>
+        </w:rPr>
+      </w:pPr>
+    </w:p>
+    <w:p>
+      <w:pPr>
+        <w:spacing w:before="24"/>
+        <w:ind w:left="600"/>
+        <w:rPr>
+          <w:rFonts w:ascii="Arial" w:eastAsia="Arial" w:hAnsi="Arial" w:cs="Arial"/>
+          <w:b/>
+          <w:sz w:val="22"/>
+          <w:szCs w:val="22"/>
+        </w:rPr>
+      </w:pPr>
+    </w:p>
+    <w:p>
+      <w:pPr>
+        <w:spacing w:before="24"/>
+        <w:ind w:left="600"/>
+        <w:rPr>
+          <w:rFonts w:ascii="Arial" w:eastAsia="Arial" w:hAnsi="Arial" w:cs="Arial"/>
+          <w:b/>
+          <w:sz w:val="22"/>
+          <w:szCs w:val="22"/>
+        </w:rPr>
+      </w:pPr>
+    </w:p>
+    <w:p>
+      <w:pPr>
+        <w:spacing w:before="24"/>
+        <w:ind w:left="600"/>
+        <w:rPr>
+          <w:rFonts w:ascii="Arial" w:eastAsia="Arial" w:hAnsi="Arial" w:cs="Arial"/>
+          <w:b/>
+          <w:sz w:val="22"/>
+          <w:szCs w:val="22"/>
+        </w:rPr>
+      </w:pPr>
+    </w:p>
+    <w:p>
+      <w:pPr>
+        <w:spacing w:before="24"/>
+        <w:ind w:left="600"/>
+        <w:rPr>
+          <w:rFonts w:ascii="Arial" w:eastAsia="Arial" w:hAnsi="Arial" w:cs="Arial"/>
+          <w:b/>
+          <w:sz w:val="22"/>
+          <w:szCs w:val="22"/>
+        </w:rPr>
+      </w:pPr>
+      <w:r>
+        <w:rPr>
+          <w:rFonts w:ascii="Arial" w:eastAsia="Arial" w:hAnsi="Arial" w:cs="Arial"/>
+          <w:b/>
+          <w:sz w:val="22"/>
+          <w:szCs w:val="22"/>
+        </w:rPr>
+        <w:t xml:space="preserve">During my first week of industrial attachment at </w:t>
+      </w:r>
+      <w:proofErr w:type="spellStart"/>
+      <w:r>
+        <w:rPr>
+          <w:rFonts w:ascii="Arial" w:eastAsia="Arial" w:hAnsi="Arial" w:cs="Arial"/>
+          <w:b/>
+          <w:sz w:val="22"/>
+          <w:szCs w:val="22"/>
+        </w:rPr>
+        <w:t>OpenFloat</w:t>
+      </w:r>
+      <w:proofErr w:type="spellEnd"/>
+      <w:r>
+        <w:rPr>
+          <w:rFonts w:ascii="Arial" w:eastAsia="Arial" w:hAnsi="Arial" w:cs="Arial"/>
+          <w:b/>
+          <w:sz w:val="22"/>
+          <w:szCs w:val="22"/>
+        </w:rPr>
+        <w:t xml:space="preserve">, I focused on establishing the core full-stack foundation for the </w:t>
+      </w:r>
+      <w:proofErr w:type="spellStart"/>
+      <w:r>
+        <w:rPr>
+          <w:rFonts w:ascii="Arial" w:eastAsia="Arial" w:hAnsi="Arial" w:cs="Arial"/>
+          <w:b/>
+          <w:sz w:val="22"/>
+          <w:szCs w:val="22"/>
+        </w:rPr>
+        <w:t>OpenFloat</w:t>
+      </w:r>
+      <w:proofErr w:type="spellEnd"/>
+      <w:r>
+        <w:rPr>
+          <w:rFonts w:ascii="Arial" w:eastAsia="Arial" w:hAnsi="Arial" w:cs="Arial"/>
+          <w:b/>
+          <w:sz w:val="22"/>
+          <w:szCs w:val="22"/>
+        </w:rPr>
+        <w:t xml:space="preserve"> POS X enterprise platform. I began by meeting my field supervisor, reviewing technical requirements, setting up Node.js and SQLite runtime environments, and configuring Git version control. I designed the relational database schema, ensuring data integrity across user accounts, store branches, inventory categories, and customer records.</w:t>
+      </w:r>
+    </w:p>
+    <w:p>
+      <w:pPr>
+        <w:spacing w:before="24"/>
+        <w:ind w:left="600"/>
+        <w:rPr>
+          <w:rFonts w:ascii="Arial" w:eastAsia="Arial" w:hAnsi="Arial" w:cs="Arial"/>
+          <w:b/>
+          <w:sz w:val="22"/>
+          <w:szCs w:val="22"/>
+        </w:rPr>
+      </w:pPr>
+    </w:p>
+    <w:p>
+      <w:pPr>
+        <w:spacing w:before="24"/>
+        <w:ind w:left="600"/>
+        <w:rPr>
+          <w:rFonts w:ascii="Arial" w:eastAsia="Arial" w:hAnsi="Arial" w:cs="Arial"/>
+          <w:b/>
+          <w:sz w:val="22"/>
+          <w:szCs w:val="22"/>
+        </w:rPr>
+      </w:pPr>
+      <w:r>
+        <w:rPr>
+          <w:rFonts w:ascii="Arial" w:eastAsia="Arial" w:hAnsi="Arial" w:cs="Arial"/>
+          <w:b/>
+          <w:sz w:val="22"/>
+          <w:szCs w:val="22"/>
+        </w:rPr>
+        <w:t>Technically, I learned how to build a lightweight, dependency-free Single Page Application (SPA) using native HTML5, modern CSS3 design tokens, and modular ES6 JavaScript alongside an Express REST API backend. I implemented JSON Web Token (JWT) bearer authentication, securing API endpoints while maintaining smooth client-side session persistence.</w:t>
+      </w:r>
+    </w:p>
+    <w:p>
+      <w:pPr>
+        <w:spacing w:before="24"/>
+        <w:ind w:left="600"/>
+        <w:rPr>
+          <w:rFonts w:ascii="Arial" w:eastAsia="Arial" w:hAnsi="Arial" w:cs="Arial"/>
+          <w:b/>
+          <w:sz w:val="22"/>
+          <w:szCs w:val="22"/>
+        </w:rPr>
+      </w:pPr>
+      <w:r>
+        <w:rPr>
+          <w:rFonts w:ascii="Arial" w:eastAsia="Arial" w:hAnsi="Arial" w:cs="Arial"/>
+          <w:b/>
+          <w:sz w:val="22"/>
+          <w:szCs w:val="22"/>
+        </w:rPr>
+        <w:t>A minor challenge I encountered was handling asynchronous database initialization in Node.js when using sql.js WASM bindings. Initially, API endpoints failed when hit immediately on server boot because the database file hadn't fully initialized into memory. I resolved this by wrapping the database handle in an asynchronous getter (</w:t>
+      </w:r>
+      <w:proofErr w:type="spellStart"/>
+      <w:proofErr w:type="gramStart"/>
+      <w:r>
+        <w:rPr>
+          <w:rFonts w:ascii="Arial" w:eastAsia="Arial" w:hAnsi="Arial" w:cs="Arial"/>
+          <w:b/>
+          <w:sz w:val="22"/>
+          <w:szCs w:val="22"/>
+        </w:rPr>
+        <w:t>getDb</w:t>
+      </w:r>
+      <w:proofErr w:type="spellEnd"/>
+      <w:r>
+        <w:rPr>
+          <w:rFonts w:ascii="Arial" w:eastAsia="Arial" w:hAnsi="Arial" w:cs="Arial"/>
+          <w:b/>
+          <w:sz w:val="22"/>
+          <w:szCs w:val="22"/>
+        </w:rPr>
+        <w:t>(</w:t>
+      </w:r>
+      <w:proofErr w:type="gramEnd"/>
+      <w:r>
+        <w:rPr>
+          <w:rFonts w:ascii="Arial" w:eastAsia="Arial" w:hAnsi="Arial" w:cs="Arial"/>
+          <w:b/>
+          <w:sz w:val="22"/>
+          <w:szCs w:val="22"/>
+        </w:rPr>
+        <w:t>)) that promises initialization before processing incoming API requests.</w:t>
+      </w:r>
+    </w:p>
+    <w:p>
+      <w:pPr>
+        <w:spacing w:before="24"/>
+        <w:ind w:left="600"/>
+        <w:rPr>
+          <w:rFonts w:ascii="Arial" w:eastAsia="Arial" w:hAnsi="Arial" w:cs="Arial"/>
+          <w:b/>
+          <w:sz w:val="22"/>
+          <w:szCs w:val="22"/>
+        </w:rPr>
+      </w:pPr>
+    </w:p>
+    <w:p>
+      <w:pPr>
+        <w:spacing w:before="24"/>
+        <w:ind w:left="600"/>
+        <w:rPr>
+          <w:rFonts w:ascii="Arial" w:eastAsia="Arial" w:hAnsi="Arial" w:cs="Arial"/>
+          <w:b/>
+          <w:sz w:val="22"/>
+          <w:szCs w:val="22"/>
+        </w:rPr>
+      </w:pPr>
+    </w:p>
+    <w:p>
+      <w:pPr>
+        <w:spacing w:before="24"/>
+        <w:ind w:left="600"/>
+        <w:rPr>
+          <w:rFonts w:ascii="Arial" w:eastAsia="Arial" w:hAnsi="Arial" w:cs="Arial"/>
+          <w:b/>
+          <w:sz w:val="22"/>
+          <w:szCs w:val="22"/>
+        </w:rPr>
+      </w:pPr>
+    </w:p>
+    <w:p>
+      <w:pPr>
+        <w:spacing w:before="24"/>
+        <w:ind w:left="600"/>
+        <w:rPr>
+          <w:rFonts w:ascii="Arial" w:eastAsia="Arial" w:hAnsi="Arial" w:cs="Arial"/>
+          <w:b/>
+          <w:sz w:val="22"/>
+          <w:szCs w:val="22"/>
+        </w:rPr>
+      </w:pPr>
+    </w:p>
+    <w:p>
+      <w:pPr>
+        <w:spacing w:before="24"/>
+        <w:ind w:left="600"/>
+        <w:rPr>
+          <w:rFonts w:ascii="Arial" w:eastAsia="Arial" w:hAnsi="Arial" w:cs="Arial"/>
+          <w:b/>
+          <w:sz w:val="22"/>
+          <w:szCs w:val="22"/>
+        </w:rPr>
+      </w:pPr>
+    </w:p>
+    <w:p>
+      <w:pPr>
+        <w:spacing w:before="24"/>
+        <w:ind w:left="600"/>
+        <w:rPr>
+          <w:rFonts w:ascii="Arial" w:eastAsia="Arial" w:hAnsi="Arial" w:cs="Arial"/>
+          <w:b/>
+          <w:sz w:val="22"/>
+          <w:szCs w:val="22"/>
+        </w:rPr>
+      </w:pPr>
+    </w:p>
+    <w:p>
+      <w:pPr>
+        <w:spacing w:before="24"/>
+        <w:ind w:left="600"/>
+        <w:rPr>
+          <w:rFonts w:ascii="Arial" w:eastAsia="Arial" w:hAnsi="Arial" w:cs="Arial"/>
+          <w:b/>
+          <w:sz w:val="22"/>
+          <w:szCs w:val="22"/>
+        </w:rPr>
+      </w:pPr>
+    </w:p>
+    <w:p>
+      <w:pPr>
+        <w:spacing w:before="24"/>
+        <w:ind w:left="600"/>
+        <w:rPr>
+          <w:rFonts w:ascii="Arial" w:eastAsia="Arial" w:hAnsi="Arial" w:cs="Arial"/>
+          <w:b/>
+          <w:sz w:val="22"/>
+          <w:szCs w:val="22"/>
+        </w:rPr>
+      </w:pPr>
+    </w:p>
+    <w:p>
+      <w:pPr>
+        <w:spacing w:before="24"/>
+        <w:ind w:left="600"/>
+        <w:rPr>
+          <w:rFonts w:ascii="Arial" w:eastAsia="Arial" w:hAnsi="Arial" w:cs="Arial"/>
+          <w:b/>
+          <w:sz w:val="22"/>
+          <w:szCs w:val="22"/>
+        </w:rPr>
+      </w:pPr>
+    </w:p>
+    <w:p>
+      <w:pPr>
+        <w:spacing w:before="24"/>
+        <w:ind w:left="600"/>
+        <w:rPr>
+          <w:rFonts w:ascii="Arial" w:eastAsia="Arial" w:hAnsi="Arial" w:cs="Arial"/>
+          <w:b/>
+          <w:sz w:val="22"/>
+          <w:szCs w:val="22"/>
+        </w:rPr>
+      </w:pPr>
+    </w:p>
+    <w:p>
+      <w:pPr>
+        <w:spacing w:before="24"/>
+        <w:ind w:left="600"/>
+        <w:rPr>
+          <w:rFonts w:ascii="Arial" w:eastAsia="Arial" w:hAnsi="Arial" w:cs="Arial"/>
+          <w:b/>
+          <w:sz w:val="22"/>
+          <w:szCs w:val="22"/>
+        </w:rPr>
+      </w:pPr>
+    </w:p>
+    <w:p>
+      <w:pPr>
+        <w:spacing w:before="24"/>
+        <w:ind w:left="600"/>
+        <w:rPr>
+          <w:rFonts w:ascii="Arial" w:eastAsia="Arial" w:hAnsi="Arial" w:cs="Arial"/>
+          <w:b/>
+          <w:sz w:val="22"/>
+          <w:szCs w:val="22"/>
+        </w:rPr>
+      </w:pPr>
+    </w:p>
+    <w:p>
+      <w:pPr>
+        <w:spacing w:before="24"/>
+        <w:ind w:left="600"/>
+        <w:rPr>
+          <w:rFonts w:ascii="Arial" w:eastAsia="Arial" w:hAnsi="Arial" w:cs="Arial"/>
+          <w:b/>
+          <w:sz w:val="22"/>
+          <w:szCs w:val="22"/>
+        </w:rPr>
+      </w:pPr>
+    </w:p>
+    <w:p>
+      <w:pPr>
+        <w:spacing w:before="24"/>
+        <w:ind w:left="600"/>
+        <w:rPr>
+          <w:rFonts w:ascii="Arial" w:eastAsia="Arial" w:hAnsi="Arial" w:cs="Arial"/>
+          <w:b/>
+          <w:sz w:val="22"/>
+          <w:szCs w:val="22"/>
+        </w:rPr>
+      </w:pPr>
+    </w:p>
+    <w:p>
+      <w:pPr>
+        <w:spacing w:before="24"/>
+        <w:ind w:left="600"/>
+        <w:rPr>
+          <w:rFonts w:ascii="Arial" w:eastAsia="Arial" w:hAnsi="Arial" w:cs="Arial"/>
+          <w:b/>
+          <w:sz w:val="22"/>
+          <w:szCs w:val="22"/>
+        </w:rPr>
+      </w:pPr>
+    </w:p>
+    <w:p>
+      <w:pPr>
+        <w:spacing w:before="24"/>
+        <w:ind w:left="600"/>
+        <w:rPr>
+          <w:rFonts w:ascii="Arial" w:eastAsia="Arial" w:hAnsi="Arial" w:cs="Arial"/>
+          <w:b/>
+          <w:sz w:val="22"/>
+          <w:szCs w:val="22"/>
+        </w:rPr>
+      </w:pPr>
+    </w:p>
+    <w:p>
+      <w:pPr>
+        <w:spacing w:before="24"/>
+        <w:ind w:left="600"/>
+        <w:rPr>
+          <w:rFonts w:ascii="Arial" w:eastAsia="Arial" w:hAnsi="Arial" w:cs="Arial"/>
+          <w:b/>
+          <w:sz w:val="22"/>
+          <w:szCs w:val="22"/>
+        </w:rPr>
+      </w:pPr>
+    </w:p>
+    <w:p>
+      <w:pPr>
+        <w:spacing w:before="24"/>
+        <w:ind w:left="600"/>
+        <w:rPr>
+          <w:rFonts w:ascii="Arial" w:eastAsia="Arial" w:hAnsi="Arial" w:cs="Arial"/>
+          <w:b/>
+          <w:sz w:val="22"/>
+          <w:szCs w:val="22"/>
+        </w:rPr>
+      </w:pPr>
+    </w:p>
+    <w:p>
+      <w:pPr>
+        <w:spacing w:before="24"/>
+        <w:ind w:left="600"/>
+        <w:rPr>
+          <w:rFonts w:ascii="Arial" w:eastAsia="Arial" w:hAnsi="Arial" w:cs="Arial"/>
+          <w:b/>
+          <w:sz w:val="22"/>
+          <w:szCs w:val="22"/>
+        </w:rPr>
+      </w:pPr>
+    </w:p>
+    <w:p>
+      <w:pPr>
+        <w:spacing w:before="24"/>
+        <w:ind w:left="600"/>
+        <w:rPr>
+          <w:rFonts w:ascii="Arial" w:eastAsia="Arial" w:hAnsi="Arial" w:cs="Arial"/>
+          <w:b/>
+          <w:sz w:val="22"/>
+          <w:szCs w:val="22"/>
+        </w:rPr>
+      </w:pPr>
+    </w:p>
+    <w:p>
+      <w:pPr>
+        <w:spacing w:before="24"/>
+        <w:ind w:left="600"/>
+        <w:rPr>
+          <w:rFonts w:ascii="Arial" w:eastAsia="Arial" w:hAnsi="Arial" w:cs="Arial"/>
+          <w:b/>
+          <w:sz w:val="22"/>
+          <w:szCs w:val="22"/>
+        </w:rPr>
+      </w:pPr>
+    </w:p>
+    <w:p>
+      <w:pPr>
+        <w:spacing w:before="24"/>
+        <w:ind w:left="600"/>
+        <w:rPr>
+          <w:rFonts w:ascii="Arial" w:eastAsia="Arial" w:hAnsi="Arial" w:cs="Arial"/>
+          <w:b/>
+          <w:sz w:val="22"/>
+          <w:szCs w:val="22"/>
+        </w:rPr>
+      </w:pPr>
+    </w:p>
+    <w:p>
+      <w:pPr>
+        <w:spacing w:before="24"/>
+        <w:ind w:left="600"/>
+        <w:rPr>
+          <w:rFonts w:ascii="Arial" w:eastAsia="Arial" w:hAnsi="Arial" w:cs="Arial"/>
+          <w:b/>
+          <w:sz w:val="22"/>
+          <w:szCs w:val="22"/>
+        </w:rPr>
+      </w:pPr>
+    </w:p>
+    <w:p>
+      <w:pPr>
+        <w:spacing w:before="24"/>
+        <w:ind w:left="600"/>
+        <w:rPr>
+          <w:rFonts w:ascii="Arial" w:eastAsia="Arial" w:hAnsi="Arial" w:cs="Arial"/>
+          <w:b/>
+          <w:sz w:val="22"/>
+          <w:szCs w:val="22"/>
+        </w:rPr>
+      </w:pPr>
+    </w:p>
+    <w:p>
+      <w:pPr>
+        <w:spacing w:before="24"/>
+        <w:ind w:left="600"/>
+        <w:rPr>
+          <w:rFonts w:ascii="Arial" w:eastAsia="Arial" w:hAnsi="Arial" w:cs="Arial"/>
+          <w:b/>
+          <w:sz w:val="22"/>
+          <w:szCs w:val="22"/>
+        </w:rPr>
+      </w:pPr>
+    </w:p>
+    <w:p>
+      <w:pPr>
+        <w:spacing w:before="24"/>
+        <w:rPr>
+          <w:rFonts w:ascii="Arial" w:eastAsia="Arial" w:hAnsi="Arial" w:cs="Arial"/>
+          <w:sz w:val="22"/>
+          <w:szCs w:val="22"/>
+        </w:rPr>
+      </w:pPr>
+      <w:r>
+        <w:rPr>
+          <w:rFonts w:ascii="Arial" w:eastAsia="Arial" w:hAnsi="Arial" w:cs="Arial"/>
+          <w:b/>
+          <w:sz w:val="22"/>
+          <w:szCs w:val="22"/>
+        </w:rPr>
+        <w:t xml:space="preserve">      </w:t>
+      </w:r>
+      <w:r>
+        <w:rPr>
+          <w:rFonts w:ascii="Arial" w:eastAsia="Arial" w:hAnsi="Arial" w:cs="Arial"/>
+          <w:sz w:val="22"/>
+          <w:szCs w:val="22"/>
+        </w:rPr>
+        <w:t xml:space="preserve">Student </w:t>
+      </w:r>
+      <w:r>
+        <w:rPr>
+          <w:rFonts w:ascii="Arial" w:eastAsia="Arial" w:hAnsi="Arial" w:cs="Arial"/>
+          <w:spacing w:val="-1"/>
+          <w:sz w:val="22"/>
+          <w:szCs w:val="22"/>
+        </w:rPr>
+        <w:t>Si</w:t>
+      </w:r>
+      <w:r>
+        <w:rPr>
+          <w:rFonts w:ascii="Arial" w:eastAsia="Arial" w:hAnsi="Arial" w:cs="Arial"/>
+          <w:spacing w:val="2"/>
+          <w:sz w:val="22"/>
+          <w:szCs w:val="22"/>
+        </w:rPr>
+        <w:t>g</w:t>
+      </w:r>
+      <w:r>
+        <w:rPr>
+          <w:rFonts w:ascii="Arial" w:eastAsia="Arial" w:hAnsi="Arial" w:cs="Arial"/>
+          <w:sz w:val="22"/>
+          <w:szCs w:val="22"/>
+        </w:rPr>
+        <w:t>na</w:t>
+      </w:r>
+      <w:r>
+        <w:rPr>
+          <w:rFonts w:ascii="Arial" w:eastAsia="Arial" w:hAnsi="Arial" w:cs="Arial"/>
+          <w:spacing w:val="1"/>
+          <w:sz w:val="22"/>
+          <w:szCs w:val="22"/>
+        </w:rPr>
+        <w:t>t</w:t>
+      </w:r>
+      <w:r>
+        <w:rPr>
+          <w:rFonts w:ascii="Arial" w:eastAsia="Arial" w:hAnsi="Arial" w:cs="Arial"/>
+          <w:spacing w:val="-3"/>
+          <w:sz w:val="22"/>
+          <w:szCs w:val="22"/>
+        </w:rPr>
+        <w:t>u</w:t>
+      </w:r>
+      <w:r>
+        <w:rPr>
+          <w:rFonts w:ascii="Arial" w:eastAsia="Arial" w:hAnsi="Arial" w:cs="Arial"/>
+          <w:spacing w:val="1"/>
+          <w:sz w:val="22"/>
+          <w:szCs w:val="22"/>
+        </w:rPr>
+        <w:t>r</w:t>
+      </w:r>
+      <w:r>
+        <w:rPr>
+          <w:rFonts w:ascii="Arial" w:eastAsia="Arial" w:hAnsi="Arial" w:cs="Arial"/>
+          <w:sz w:val="22"/>
+          <w:szCs w:val="22"/>
+        </w:rPr>
+        <w:t>e. …</w:t>
+      </w:r>
+      <w:r>
+        <w:rPr>
+          <w:rFonts w:ascii="Arial" w:eastAsia="Arial" w:hAnsi="Arial" w:cs="Arial"/>
+          <w:spacing w:val="-2"/>
+          <w:sz w:val="22"/>
+          <w:szCs w:val="22"/>
+        </w:rPr>
+        <w:t>…</w:t>
+      </w:r>
+      <w:r>
+        <w:rPr>
+          <w:rFonts w:ascii="Arial" w:eastAsia="Arial" w:hAnsi="Arial" w:cs="Arial"/>
+          <w:sz w:val="22"/>
+          <w:szCs w:val="22"/>
+        </w:rPr>
         <w:t>……</w:t>
       </w:r>
       <w:r>
         <w:rPr>
           <w:rFonts w:ascii="Arial" w:eastAsia="Arial" w:hAnsi="Arial" w:cs="Arial"/>
+          <w:spacing w:val="-2"/>
+          <w:sz w:val="22"/>
+          <w:szCs w:val="22"/>
+        </w:rPr>
+        <w:t>…</w:t>
+      </w:r>
+      <w:r>
+        <w:rPr>
+          <w:rFonts w:ascii="Arial" w:eastAsia="Arial" w:hAnsi="Arial" w:cs="Arial"/>
+          <w:sz w:val="22"/>
+          <w:szCs w:val="22"/>
+        </w:rPr>
+        <w:t>………</w:t>
+      </w:r>
+      <w:r>
+        <w:rPr>
+          <w:rFonts w:ascii="Arial" w:eastAsia="Arial" w:hAnsi="Arial" w:cs="Arial"/>
+          <w:spacing w:val="-2"/>
+          <w:sz w:val="22"/>
+          <w:szCs w:val="22"/>
+        </w:rPr>
+        <w:t>…</w:t>
+      </w:r>
+      <w:r>
+        <w:rPr>
+          <w:rFonts w:ascii="Arial" w:eastAsia="Arial" w:hAnsi="Arial" w:cs="Arial"/>
+          <w:sz w:val="22"/>
+          <w:szCs w:val="22"/>
+        </w:rPr>
+        <w:t xml:space="preserve">.   </w:t>
+      </w:r>
+      <w:r>
+        <w:rPr>
+          <w:rFonts w:ascii="Arial" w:eastAsia="Arial" w:hAnsi="Arial" w:cs="Arial"/>
+          <w:spacing w:val="38"/>
+          <w:sz w:val="22"/>
+          <w:szCs w:val="22"/>
+        </w:rPr>
+        <w:t xml:space="preserve"> </w:t>
+      </w:r>
+      <w:r>
+        <w:rPr>
+          <w:rFonts w:ascii="Arial" w:eastAsia="Arial" w:hAnsi="Arial" w:cs="Arial"/>
           <w:spacing w:val="-1"/>
           <w:sz w:val="22"/>
           <w:szCs w:val="22"/>
         </w:rPr>
+        <w:t>D</w:t>
+      </w:r>
+      <w:r>
+        <w:rPr>
+          <w:rFonts w:ascii="Arial" w:eastAsia="Arial" w:hAnsi="Arial" w:cs="Arial"/>
+          <w:sz w:val="22"/>
+          <w:szCs w:val="22"/>
+        </w:rPr>
+        <w:t>a</w:t>
+      </w:r>
+      <w:r>
+        <w:rPr>
+          <w:rFonts w:ascii="Arial" w:eastAsia="Arial" w:hAnsi="Arial" w:cs="Arial"/>
+          <w:spacing w:val="1"/>
+          <w:sz w:val="22"/>
+          <w:szCs w:val="22"/>
+        </w:rPr>
+        <w:t>t</w:t>
+      </w:r>
+      <w:r>
+        <w:rPr>
+          <w:rFonts w:ascii="Arial" w:eastAsia="Arial" w:hAnsi="Arial" w:cs="Arial"/>
+          <w:sz w:val="22"/>
+          <w:szCs w:val="22"/>
+        </w:rPr>
+        <w:t>e</w:t>
+      </w:r>
+      <w:r>
+        <w:rPr>
+          <w:rFonts w:ascii="Arial" w:eastAsia="Arial" w:hAnsi="Arial" w:cs="Arial"/>
+          <w:spacing w:val="1"/>
+          <w:sz w:val="22"/>
+          <w:szCs w:val="22"/>
+        </w:rPr>
+        <w:t xml:space="preserve"> </w:t>
+      </w:r>
+      <w:r>
+        <w:rPr>
+          <w:rFonts w:ascii="Arial" w:eastAsia="Arial" w:hAnsi="Arial" w:cs="Arial"/>
+          <w:spacing w:val="-2"/>
+          <w:sz w:val="22"/>
+          <w:szCs w:val="22"/>
+        </w:rPr>
+        <w:t>…</w:t>
+      </w:r>
+      <w:r>
+        <w:rPr>
+          <w:rFonts w:ascii="Arial" w:eastAsia="Arial" w:hAnsi="Arial" w:cs="Arial"/>
+          <w:sz w:val="22"/>
+          <w:szCs w:val="22"/>
+        </w:rPr>
+        <w:t>……</w:t>
+      </w:r>
+      <w:r>
+        <w:rPr>
+          <w:rFonts w:ascii="Arial" w:eastAsia="Arial" w:hAnsi="Arial" w:cs="Arial"/>
+          <w:spacing w:val="-2"/>
+          <w:sz w:val="22"/>
+          <w:szCs w:val="22"/>
+        </w:rPr>
+        <w:t>…</w:t>
+      </w:r>
+      <w:r>
+        <w:rPr>
+          <w:rFonts w:ascii="Arial" w:eastAsia="Arial" w:hAnsi="Arial" w:cs="Arial"/>
+          <w:sz w:val="22"/>
+          <w:szCs w:val="22"/>
+        </w:rPr>
+        <w:t>………</w:t>
+      </w:r>
+      <w:r>
+        <w:rPr>
+          <w:rFonts w:ascii="Arial" w:eastAsia="Arial" w:hAnsi="Arial" w:cs="Arial"/>
+          <w:spacing w:val="-2"/>
+          <w:sz w:val="22"/>
+          <w:szCs w:val="22"/>
+        </w:rPr>
+        <w:t>…</w:t>
+      </w:r>
+      <w:r>
+        <w:rPr>
+          <w:rFonts w:ascii="Arial" w:eastAsia="Arial" w:hAnsi="Arial" w:cs="Arial"/>
+          <w:sz w:val="22"/>
+          <w:szCs w:val="22"/>
+        </w:rPr>
+        <w:t>………</w:t>
+      </w:r>
+      <w:r>
+        <w:rPr>
+          <w:rFonts w:ascii="Arial" w:eastAsia="Arial" w:hAnsi="Arial" w:cs="Arial"/>
+          <w:spacing w:val="-2"/>
+          <w:sz w:val="22"/>
+          <w:szCs w:val="22"/>
+        </w:rPr>
+        <w:t>…</w:t>
+      </w:r>
+      <w:r>
+        <w:rPr>
+          <w:rFonts w:ascii="Arial" w:eastAsia="Arial" w:hAnsi="Arial" w:cs="Arial"/>
+          <w:sz w:val="22"/>
+          <w:szCs w:val="22"/>
+        </w:rPr>
+        <w:t>…</w:t>
+      </w:r>
+      <w:proofErr w:type="gramStart"/>
+      <w:r>
+        <w:rPr>
+          <w:rFonts w:ascii="Arial" w:eastAsia="Arial" w:hAnsi="Arial" w:cs="Arial"/>
+          <w:sz w:val="22"/>
+          <w:szCs w:val="22"/>
+        </w:rPr>
+        <w:t>…</w:t>
+      </w:r>
+      <w:r>
+        <w:rPr>
+          <w:rFonts w:ascii="Arial" w:eastAsia="Arial" w:hAnsi="Arial" w:cs="Arial"/>
+          <w:spacing w:val="-1"/>
+          <w:sz w:val="22"/>
+          <w:szCs w:val="22"/>
+        </w:rPr>
         <w:t>.</w:t>
       </w:r>
       <w:r>
@@ -2682,792 +3728,7 @@
         </w:rPr>
         <w:t>.</w:t>
       </w:r>
-    </w:p>
-    <w:p>
-      <w:pPr>
-        <w:spacing w:before="24"/>
-        <w:ind w:left="600"/>
-        <w:rPr>
-          <w:rFonts w:ascii="Arial" w:eastAsia="Arial" w:hAnsi="Arial" w:cs="Arial"/>
-          <w:b/>
-          <w:sz w:val="22"/>
-          <w:szCs w:val="22"/>
-        </w:rPr>
-      </w:pPr>
-      <w:r>
-        <w:rPr>
-          <w:rFonts w:ascii="Arial" w:eastAsia="Arial" w:hAnsi="Arial" w:cs="Arial"/>
-          <w:b/>
-          <w:sz w:val="22"/>
-          <w:szCs w:val="22"/>
-        </w:rPr>
-        <w:t xml:space="preserve">STUDENT’S WEEKLY </w:t>
-      </w:r>
-      <w:r>
-        <w:rPr>
-          <w:rFonts w:ascii="Arial" w:eastAsia="Arial" w:hAnsi="Arial" w:cs="Arial"/>
-          <w:b/>
-          <w:sz w:val="22"/>
-          <w:szCs w:val="22"/>
-        </w:rPr>
-        <w:t>REPORT (</w:t>
-      </w:r>
-      <w:r>
-        <w:rPr>
-          <w:rFonts w:ascii="Arial" w:eastAsia="Arial" w:hAnsi="Arial" w:cs="Arial"/>
-          <w:b/>
-          <w:sz w:val="22"/>
-          <w:szCs w:val="22"/>
-        </w:rPr>
-        <w:t>WEEK 1)</w:t>
-      </w:r>
-    </w:p>
-    <w:p>
-      <w:pPr>
-        <w:spacing w:before="24"/>
-        <w:ind w:left="600"/>
-        <w:rPr>
-          <w:rFonts w:ascii="Arial" w:eastAsia="Arial" w:hAnsi="Arial" w:cs="Arial"/>
-          <w:b/>
-          <w:sz w:val="22"/>
-          <w:szCs w:val="22"/>
-        </w:rPr>
-      </w:pPr>
-    </w:p>
-    <w:p>
-      <w:pPr>
-        <w:spacing w:before="24"/>
-        <w:ind w:left="600"/>
-        <w:rPr>
-          <w:rFonts w:ascii="Arial" w:eastAsia="Arial" w:hAnsi="Arial" w:cs="Arial"/>
-          <w:b/>
-          <w:sz w:val="22"/>
-          <w:szCs w:val="22"/>
-        </w:rPr>
-      </w:pPr>
-    </w:p>
-    <w:p>
-      <w:pPr>
-        <w:spacing w:before="24"/>
-        <w:ind w:left="600"/>
-        <w:rPr>
-          <w:rFonts w:ascii="Arial" w:eastAsia="Arial" w:hAnsi="Arial" w:cs="Arial"/>
-          <w:b/>
-          <w:sz w:val="22"/>
-          <w:szCs w:val="22"/>
-        </w:rPr>
-      </w:pPr>
-    </w:p>
-    <w:p>
-      <w:pPr>
-        <w:spacing w:before="24"/>
-        <w:ind w:left="600"/>
-        <w:rPr>
-          <w:rFonts w:ascii="Arial" w:eastAsia="Arial" w:hAnsi="Arial" w:cs="Arial"/>
-          <w:b/>
-          <w:sz w:val="22"/>
-          <w:szCs w:val="22"/>
-        </w:rPr>
-      </w:pPr>
-    </w:p>
-    <w:p>
-      <w:pPr>
-        <w:spacing w:before="24"/>
-        <w:ind w:left="600"/>
-        <w:rPr>
-          <w:rFonts w:ascii="Arial" w:eastAsia="Arial" w:hAnsi="Arial" w:cs="Arial"/>
-          <w:b/>
-          <w:sz w:val="22"/>
-          <w:szCs w:val="22"/>
-        </w:rPr>
-      </w:pPr>
-    </w:p>
-    <w:p>
-      <w:pPr>
-        <w:spacing w:before="24"/>
-        <w:ind w:left="600"/>
-        <w:rPr>
-          <w:rFonts w:ascii="Arial" w:eastAsia="Arial" w:hAnsi="Arial" w:cs="Arial"/>
-          <w:b/>
-          <w:sz w:val="22"/>
-          <w:szCs w:val="22"/>
-        </w:rPr>
-      </w:pPr>
-    </w:p>
-    <w:p>
-      <w:pPr>
-        <w:spacing w:before="24"/>
-        <w:ind w:left="600"/>
-        <w:rPr>
-          <w:rFonts w:ascii="Arial" w:eastAsia="Arial" w:hAnsi="Arial" w:cs="Arial"/>
-          <w:b/>
-          <w:sz w:val="22"/>
-          <w:szCs w:val="22"/>
-        </w:rPr>
-      </w:pPr>
-    </w:p>
-    <w:p>
-      <w:pPr>
-        <w:spacing w:before="24"/>
-        <w:ind w:left="600"/>
-        <w:rPr>
-          <w:rFonts w:ascii="Arial" w:eastAsia="Arial" w:hAnsi="Arial" w:cs="Arial"/>
-          <w:b/>
-          <w:sz w:val="22"/>
-          <w:szCs w:val="22"/>
-        </w:rPr>
-      </w:pPr>
-    </w:p>
-    <w:p>
-      <w:pPr>
-        <w:spacing w:before="24"/>
-        <w:ind w:left="600"/>
-        <w:rPr>
-          <w:rFonts w:ascii="Arial" w:eastAsia="Arial" w:hAnsi="Arial" w:cs="Arial"/>
-          <w:b/>
-          <w:sz w:val="22"/>
-          <w:szCs w:val="22"/>
-        </w:rPr>
-      </w:pPr>
-      <w:r>
-        <w:rPr>
-          <w:rFonts w:ascii="Arial" w:eastAsia="Arial" w:hAnsi="Arial" w:cs="Arial"/>
-          <w:b/>
-          <w:sz w:val="22"/>
-          <w:szCs w:val="22"/>
-        </w:rPr>
-        <w:t>During my first week of industrial attachment at OpenFloat, I focused on establishing the core full-stack foundation for the OpenFloat POS X enterprise platform. I began by meeting my field supervisor, reviewing technical requirements, setting up Node.js and SQLite runtime environments, and configuring Git version control. I designed the relational database schema, ensuring data integrity across user accounts, store branches, inventory categories, and customer records.</w:t>
-      </w:r>
-    </w:p>
-    <w:p>
-      <w:pPr>
-        <w:spacing w:before="24"/>
-        <w:ind w:left="600"/>
-        <w:rPr>
-          <w:rFonts w:ascii="Arial" w:eastAsia="Arial" w:hAnsi="Arial" w:cs="Arial"/>
-          <w:b/>
-          <w:sz w:val="22"/>
-          <w:szCs w:val="22"/>
-        </w:rPr>
-      </w:pPr>
-    </w:p>
-    <w:p>
-      <w:pPr>
-        <w:spacing w:before="24"/>
-        <w:ind w:left="600"/>
-        <w:rPr>
-          <w:rFonts w:ascii="Arial" w:eastAsia="Arial" w:hAnsi="Arial" w:cs="Arial"/>
-          <w:b/>
-          <w:sz w:val="22"/>
-          <w:szCs w:val="22"/>
-        </w:rPr>
-      </w:pPr>
-      <w:r>
-        <w:rPr>
-          <w:rFonts w:ascii="Arial" w:eastAsia="Arial" w:hAnsi="Arial" w:cs="Arial"/>
-          <w:b/>
-          <w:sz w:val="22"/>
-          <w:szCs w:val="22"/>
-        </w:rPr>
-        <w:t>Technically, I learned how to build a lightweight, dependency-free Single Page Application (SPA) using native HTML5, modern CSS3 design tokens, and modular ES6 JavaScript alongside an Express REST API backend. I implemented JSON Web Token (JWT) bearer authentication, securing API endpoints while maintaining smooth client-side session persistence.</w:t>
-      </w:r>
-    </w:p>
-    <w:p>
-      <w:pPr>
-        <w:spacing w:before="24"/>
-        <w:ind w:left="600"/>
-        <w:rPr>
-          <w:rFonts w:ascii="Arial" w:eastAsia="Arial" w:hAnsi="Arial" w:cs="Arial"/>
-          <w:b/>
-          <w:sz w:val="22"/>
-          <w:szCs w:val="22"/>
-        </w:rPr>
-      </w:pPr>
-      <w:r>
-        <w:rPr>
-          <w:rFonts w:ascii="Arial" w:eastAsia="Arial" w:hAnsi="Arial" w:cs="Arial"/>
-          <w:b/>
-          <w:sz w:val="22"/>
-          <w:szCs w:val="22"/>
-        </w:rPr>
-        <w:t>A minor challenge I encountered was handling asynchronous database initialization in Node.js when using sql.js WASM bindings. Initially, API endpoints failed when hit immediately on server boot because the database file hadn't fully initialized into memory. I resolved this by wrapping the database handle in an asynchronous getter (getDb()) that promises initialization before processing incoming API requests.</w:t>
-      </w:r>
-    </w:p>
-    <w:p>
-      <w:pPr>
-        <w:spacing w:before="24"/>
-        <w:ind w:left="600"/>
-        <w:rPr>
-          <w:rFonts w:ascii="Arial" w:eastAsia="Arial" w:hAnsi="Arial" w:cs="Arial"/>
-          <w:b/>
-          <w:sz w:val="22"/>
-          <w:szCs w:val="22"/>
-        </w:rPr>
-      </w:pPr>
-    </w:p>
-    <w:p>
-      <w:pPr>
-        <w:spacing w:before="24"/>
-        <w:ind w:left="600"/>
-        <w:rPr>
-          <w:rFonts w:ascii="Arial" w:eastAsia="Arial" w:hAnsi="Arial" w:cs="Arial"/>
-          <w:b/>
-          <w:sz w:val="22"/>
-          <w:szCs w:val="22"/>
-        </w:rPr>
-      </w:pPr>
-    </w:p>
-    <w:p>
-      <w:pPr>
-        <w:spacing w:before="24"/>
-        <w:ind w:left="600"/>
-        <w:rPr>
-          <w:rFonts w:ascii="Arial" w:eastAsia="Arial" w:hAnsi="Arial" w:cs="Arial"/>
-          <w:b/>
-          <w:sz w:val="22"/>
-          <w:szCs w:val="22"/>
-        </w:rPr>
-      </w:pPr>
-    </w:p>
-    <w:p>
-      <w:pPr>
-        <w:spacing w:before="24"/>
-        <w:ind w:left="600"/>
-        <w:rPr>
-          <w:rFonts w:ascii="Arial" w:eastAsia="Arial" w:hAnsi="Arial" w:cs="Arial"/>
-          <w:b/>
-          <w:sz w:val="22"/>
-          <w:szCs w:val="22"/>
-        </w:rPr>
-      </w:pPr>
-    </w:p>
-    <w:p>
-      <w:pPr>
-        <w:spacing w:before="24"/>
-        <w:ind w:left="600"/>
-        <w:rPr>
-          <w:rFonts w:ascii="Arial" w:eastAsia="Arial" w:hAnsi="Arial" w:cs="Arial"/>
-          <w:b/>
-          <w:sz w:val="22"/>
-          <w:szCs w:val="22"/>
-        </w:rPr>
-      </w:pPr>
-    </w:p>
-    <w:p>
-      <w:pPr>
-        <w:spacing w:before="24"/>
-        <w:ind w:left="600"/>
-        <w:rPr>
-          <w:rFonts w:ascii="Arial" w:eastAsia="Arial" w:hAnsi="Arial" w:cs="Arial"/>
-          <w:b/>
-          <w:sz w:val="22"/>
-          <w:szCs w:val="22"/>
-        </w:rPr>
-      </w:pPr>
-    </w:p>
-    <w:p>
-      <w:pPr>
-        <w:spacing w:before="24"/>
-        <w:ind w:left="600"/>
-        <w:rPr>
-          <w:rFonts w:ascii="Arial" w:eastAsia="Arial" w:hAnsi="Arial" w:cs="Arial"/>
-          <w:b/>
-          <w:sz w:val="22"/>
-          <w:szCs w:val="22"/>
-        </w:rPr>
-      </w:pPr>
-    </w:p>
-    <w:p>
-      <w:pPr>
-        <w:spacing w:before="24"/>
-        <w:ind w:left="600"/>
-        <w:rPr>
-          <w:rFonts w:ascii="Arial" w:eastAsia="Arial" w:hAnsi="Arial" w:cs="Arial"/>
-          <w:b/>
-          <w:sz w:val="22"/>
-          <w:szCs w:val="22"/>
-        </w:rPr>
-      </w:pPr>
-    </w:p>
-    <w:p>
-      <w:pPr>
-        <w:spacing w:before="24"/>
-        <w:ind w:left="600"/>
-        <w:rPr>
-          <w:rFonts w:ascii="Arial" w:eastAsia="Arial" w:hAnsi="Arial" w:cs="Arial"/>
-          <w:b/>
-          <w:sz w:val="22"/>
-          <w:szCs w:val="22"/>
-        </w:rPr>
-      </w:pPr>
-    </w:p>
-    <w:p>
-      <w:pPr>
-        <w:spacing w:before="24"/>
-        <w:ind w:left="600"/>
-        <w:rPr>
-          <w:rFonts w:ascii="Arial" w:eastAsia="Arial" w:hAnsi="Arial" w:cs="Arial"/>
-          <w:b/>
-          <w:sz w:val="22"/>
-          <w:szCs w:val="22"/>
-        </w:rPr>
-      </w:pPr>
-    </w:p>
-    <w:p>
-      <w:pPr>
-        <w:spacing w:before="24"/>
-        <w:ind w:left="600"/>
-        <w:rPr>
-          <w:rFonts w:ascii="Arial" w:eastAsia="Arial" w:hAnsi="Arial" w:cs="Arial"/>
-          <w:b/>
-          <w:sz w:val="22"/>
-          <w:szCs w:val="22"/>
-        </w:rPr>
-      </w:pPr>
-    </w:p>
-    <w:p>
-      <w:pPr>
-        <w:spacing w:before="24"/>
-        <w:ind w:left="600"/>
-        <w:rPr>
-          <w:rFonts w:ascii="Arial" w:eastAsia="Arial" w:hAnsi="Arial" w:cs="Arial"/>
-          <w:b/>
-          <w:sz w:val="22"/>
-          <w:szCs w:val="22"/>
-        </w:rPr>
-      </w:pPr>
-    </w:p>
-    <w:p>
-      <w:pPr>
-        <w:spacing w:before="24"/>
-        <w:ind w:left="600"/>
-        <w:rPr>
-          <w:rFonts w:ascii="Arial" w:eastAsia="Arial" w:hAnsi="Arial" w:cs="Arial"/>
-          <w:b/>
-          <w:sz w:val="22"/>
-          <w:szCs w:val="22"/>
-        </w:rPr>
-      </w:pPr>
-    </w:p>
-    <w:p>
-      <w:pPr>
-        <w:spacing w:before="24"/>
-        <w:ind w:left="600"/>
-        <w:rPr>
-          <w:rFonts w:ascii="Arial" w:eastAsia="Arial" w:hAnsi="Arial" w:cs="Arial"/>
-          <w:b/>
-          <w:sz w:val="22"/>
-          <w:szCs w:val="22"/>
-        </w:rPr>
-      </w:pPr>
-    </w:p>
-    <w:p>
-      <w:pPr>
-        <w:spacing w:before="24"/>
-        <w:ind w:left="600"/>
-        <w:rPr>
-          <w:rFonts w:ascii="Arial" w:eastAsia="Arial" w:hAnsi="Arial" w:cs="Arial"/>
-          <w:b/>
-          <w:sz w:val="22"/>
-          <w:szCs w:val="22"/>
-        </w:rPr>
-      </w:pPr>
-    </w:p>
-    <w:p>
-      <w:pPr>
-        <w:spacing w:before="24"/>
-        <w:ind w:left="600"/>
-        <w:rPr>
-          <w:rFonts w:ascii="Arial" w:eastAsia="Arial" w:hAnsi="Arial" w:cs="Arial"/>
-          <w:b/>
-          <w:sz w:val="22"/>
-          <w:szCs w:val="22"/>
-        </w:rPr>
-      </w:pPr>
-    </w:p>
-    <w:p>
-      <w:pPr>
-        <w:spacing w:before="24"/>
-        <w:ind w:left="600"/>
-        <w:rPr>
-          <w:rFonts w:ascii="Arial" w:eastAsia="Arial" w:hAnsi="Arial" w:cs="Arial"/>
-          <w:b/>
-          <w:sz w:val="22"/>
-          <w:szCs w:val="22"/>
-        </w:rPr>
-      </w:pPr>
-    </w:p>
-    <w:p>
-      <w:pPr>
-        <w:spacing w:before="24"/>
-        <w:ind w:left="600"/>
-        <w:rPr>
-          <w:rFonts w:ascii="Arial" w:eastAsia="Arial" w:hAnsi="Arial" w:cs="Arial"/>
-          <w:b/>
-          <w:sz w:val="22"/>
-          <w:szCs w:val="22"/>
-        </w:rPr>
-      </w:pPr>
-    </w:p>
-    <w:p>
-      <w:pPr>
-        <w:spacing w:before="24"/>
-        <w:ind w:left="600"/>
-        <w:rPr>
-          <w:rFonts w:ascii="Arial" w:eastAsia="Arial" w:hAnsi="Arial" w:cs="Arial"/>
-          <w:b/>
-          <w:sz w:val="22"/>
-          <w:szCs w:val="22"/>
-        </w:rPr>
-      </w:pPr>
-    </w:p>
-    <w:p>
-      <w:pPr>
-        <w:spacing w:before="24"/>
-        <w:ind w:left="600"/>
-        <w:rPr>
-          <w:rFonts w:ascii="Arial" w:eastAsia="Arial" w:hAnsi="Arial" w:cs="Arial"/>
-          <w:b/>
-          <w:sz w:val="22"/>
-          <w:szCs w:val="22"/>
-        </w:rPr>
-      </w:pPr>
-    </w:p>
-    <w:p>
-      <w:pPr>
-        <w:spacing w:before="24"/>
-        <w:ind w:left="600"/>
-        <w:rPr>
-          <w:rFonts w:ascii="Arial" w:eastAsia="Arial" w:hAnsi="Arial" w:cs="Arial"/>
-          <w:b/>
-          <w:sz w:val="22"/>
-          <w:szCs w:val="22"/>
-        </w:rPr>
-      </w:pPr>
-    </w:p>
-    <w:p>
-      <w:pPr>
-        <w:spacing w:before="24"/>
-        <w:ind w:left="600"/>
-        <w:rPr>
-          <w:rFonts w:ascii="Arial" w:eastAsia="Arial" w:hAnsi="Arial" w:cs="Arial"/>
-          <w:b/>
-          <w:sz w:val="22"/>
-          <w:szCs w:val="22"/>
-        </w:rPr>
-      </w:pPr>
-    </w:p>
-    <w:p>
-      <w:pPr>
-        <w:spacing w:before="24"/>
-        <w:ind w:left="600"/>
-        <w:rPr>
-          <w:rFonts w:ascii="Arial" w:eastAsia="Arial" w:hAnsi="Arial" w:cs="Arial"/>
-          <w:b/>
-          <w:sz w:val="22"/>
-          <w:szCs w:val="22"/>
-        </w:rPr>
-      </w:pPr>
-    </w:p>
-    <w:p>
-      <w:pPr>
-        <w:spacing w:before="24"/>
-        <w:ind w:left="600"/>
-        <w:rPr>
-          <w:rFonts w:ascii="Arial" w:eastAsia="Arial" w:hAnsi="Arial" w:cs="Arial"/>
-          <w:b/>
-          <w:sz w:val="22"/>
-          <w:szCs w:val="22"/>
-        </w:rPr>
-      </w:pPr>
-    </w:p>
-    <w:p>
-      <w:pPr>
-        <w:spacing w:before="24"/>
-        <w:ind w:left="600"/>
-        <w:rPr>
-          <w:rFonts w:ascii="Arial" w:eastAsia="Arial" w:hAnsi="Arial" w:cs="Arial"/>
-          <w:b/>
-          <w:sz w:val="22"/>
-          <w:szCs w:val="22"/>
-        </w:rPr>
-      </w:pPr>
-    </w:p>
-    <w:p>
-      <w:pPr>
-        <w:spacing w:before="24"/>
-        <w:rPr>
-          <w:rFonts w:ascii="Arial" w:eastAsia="Arial" w:hAnsi="Arial" w:cs="Arial"/>
-          <w:sz w:val="22"/>
-          <w:szCs w:val="22"/>
-        </w:rPr>
-      </w:pPr>
-      <w:r>
-        <w:rPr>
-          <w:rFonts w:ascii="Arial" w:eastAsia="Arial" w:hAnsi="Arial" w:cs="Arial"/>
-          <w:b/>
-          <w:sz w:val="22"/>
-          <w:szCs w:val="22"/>
-        </w:rPr>
-        <w:t xml:space="preserve">      </w:t>
-      </w:r>
-      <w:r>
-        <w:rPr>
-          <w:rFonts w:ascii="Arial" w:eastAsia="Arial" w:hAnsi="Arial" w:cs="Arial"/>
-          <w:sz w:val="22"/>
-          <w:szCs w:val="22"/>
-        </w:rPr>
-        <w:t xml:space="preserve">Student </w:t>
-      </w:r>
-      <w:r>
-        <w:rPr>
-          <w:rFonts w:ascii="Arial" w:eastAsia="Arial" w:hAnsi="Arial" w:cs="Arial"/>
-          <w:spacing w:val="-1"/>
-          <w:sz w:val="22"/>
-          <w:szCs w:val="22"/>
-        </w:rPr>
-        <w:t>Si</w:t>
-      </w:r>
-      <w:r>
-        <w:rPr>
-          <w:rFonts w:ascii="Arial" w:eastAsia="Arial" w:hAnsi="Arial" w:cs="Arial"/>
-          <w:spacing w:val="2"/>
-          <w:sz w:val="22"/>
-          <w:szCs w:val="22"/>
-        </w:rPr>
-        <w:t>g</w:t>
-      </w:r>
-      <w:r>
-        <w:rPr>
-          <w:rFonts w:ascii="Arial" w:eastAsia="Arial" w:hAnsi="Arial" w:cs="Arial"/>
-          <w:sz w:val="22"/>
-          <w:szCs w:val="22"/>
-        </w:rPr>
-        <w:t>na</w:t>
-      </w:r>
-      <w:r>
-        <w:rPr>
-          <w:rFonts w:ascii="Arial" w:eastAsia="Arial" w:hAnsi="Arial" w:cs="Arial"/>
-          <w:spacing w:val="1"/>
-          <w:sz w:val="22"/>
-          <w:szCs w:val="22"/>
-        </w:rPr>
-        <w:t>t</w:t>
-      </w:r>
-      <w:r>
-        <w:rPr>
-          <w:rFonts w:ascii="Arial" w:eastAsia="Arial" w:hAnsi="Arial" w:cs="Arial"/>
-          <w:spacing w:val="-3"/>
-          <w:sz w:val="22"/>
-          <w:szCs w:val="22"/>
-        </w:rPr>
-        <w:t>u</w:t>
-      </w:r>
-      <w:r>
-        <w:rPr>
-          <w:rFonts w:ascii="Arial" w:eastAsia="Arial" w:hAnsi="Arial" w:cs="Arial"/>
-          <w:spacing w:val="1"/>
-          <w:sz w:val="22"/>
-          <w:szCs w:val="22"/>
-        </w:rPr>
-        <w:t>r</w:t>
-      </w:r>
-      <w:r>
-        <w:rPr>
-          <w:rFonts w:ascii="Arial" w:eastAsia="Arial" w:hAnsi="Arial" w:cs="Arial"/>
-          <w:sz w:val="22"/>
-          <w:szCs w:val="22"/>
-        </w:rPr>
-        <w:t>e. …</w:t>
-      </w:r>
-      <w:r>
-        <w:rPr>
-          <w:rFonts w:ascii="Arial" w:eastAsia="Arial" w:hAnsi="Arial" w:cs="Arial"/>
-          <w:spacing w:val="-2"/>
-          <w:sz w:val="22"/>
-          <w:szCs w:val="22"/>
-        </w:rPr>
-        <w:t>…</w:t>
-      </w:r>
-      <w:r>
-        <w:rPr>
-          <w:rFonts w:ascii="Arial" w:eastAsia="Arial" w:hAnsi="Arial" w:cs="Arial"/>
-          <w:sz w:val="22"/>
-          <w:szCs w:val="22"/>
-        </w:rPr>
-        <w:t>……</w:t>
-      </w:r>
-      <w:r>
-        <w:rPr>
-          <w:rFonts w:ascii="Arial" w:eastAsia="Arial" w:hAnsi="Arial" w:cs="Arial"/>
-          <w:spacing w:val="-2"/>
-          <w:sz w:val="22"/>
-          <w:szCs w:val="22"/>
-        </w:rPr>
-        <w:t>…</w:t>
-      </w:r>
-      <w:r>
-        <w:rPr>
-          <w:rFonts w:ascii="Arial" w:eastAsia="Arial" w:hAnsi="Arial" w:cs="Arial"/>
-          <w:sz w:val="22"/>
-          <w:szCs w:val="22"/>
-        </w:rPr>
-        <w:t>………</w:t>
-      </w:r>
-      <w:r>
-        <w:rPr>
-          <w:rFonts w:ascii="Arial" w:eastAsia="Arial" w:hAnsi="Arial" w:cs="Arial"/>
-          <w:spacing w:val="-2"/>
-          <w:sz w:val="22"/>
-          <w:szCs w:val="22"/>
-        </w:rPr>
-        <w:t>…</w:t>
-      </w:r>
-      <w:r>
-        <w:rPr>
-          <w:rFonts w:ascii="Arial" w:eastAsia="Arial" w:hAnsi="Arial" w:cs="Arial"/>
-          <w:sz w:val="22"/>
-          <w:szCs w:val="22"/>
-        </w:rPr>
-        <w:t xml:space="preserve">.   </w:t>
-      </w:r>
-      <w:r>
-        <w:rPr>
-          <w:rFonts w:ascii="Arial" w:eastAsia="Arial" w:hAnsi="Arial" w:cs="Arial"/>
-          <w:spacing w:val="38"/>
-          <w:sz w:val="22"/>
-          <w:szCs w:val="22"/>
-        </w:rPr>
-        <w:t xml:space="preserve"> </w:t>
-      </w:r>
-      <w:r>
-        <w:rPr>
-          <w:rFonts w:ascii="Arial" w:eastAsia="Arial" w:hAnsi="Arial" w:cs="Arial"/>
-          <w:spacing w:val="-1"/>
-          <w:sz w:val="22"/>
-          <w:szCs w:val="22"/>
-        </w:rPr>
-        <w:t>D</w:t>
-      </w:r>
-      <w:r>
-        <w:rPr>
-          <w:rFonts w:ascii="Arial" w:eastAsia="Arial" w:hAnsi="Arial" w:cs="Arial"/>
-          <w:sz w:val="22"/>
-          <w:szCs w:val="22"/>
-        </w:rPr>
-        <w:t>a</w:t>
-      </w:r>
-      <w:r>
-        <w:rPr>
-          <w:rFonts w:ascii="Arial" w:eastAsia="Arial" w:hAnsi="Arial" w:cs="Arial"/>
-          <w:spacing w:val="1"/>
-          <w:sz w:val="22"/>
-          <w:szCs w:val="22"/>
-        </w:rPr>
-        <w:t>t</w:t>
-      </w:r>
-      <w:r>
-        <w:rPr>
-          <w:rFonts w:ascii="Arial" w:eastAsia="Arial" w:hAnsi="Arial" w:cs="Arial"/>
-          <w:sz w:val="22"/>
-          <w:szCs w:val="22"/>
-        </w:rPr>
-        <w:t>e</w:t>
-      </w:r>
-      <w:r>
-        <w:rPr>
-          <w:rFonts w:ascii="Arial" w:eastAsia="Arial" w:hAnsi="Arial" w:cs="Arial"/>
-          <w:spacing w:val="1"/>
-          <w:sz w:val="22"/>
-          <w:szCs w:val="22"/>
-        </w:rPr>
-        <w:t xml:space="preserve"> </w:t>
-      </w:r>
-      <w:r>
-        <w:rPr>
-          <w:rFonts w:ascii="Arial" w:eastAsia="Arial" w:hAnsi="Arial" w:cs="Arial"/>
-          <w:spacing w:val="-2"/>
-          <w:sz w:val="22"/>
-          <w:szCs w:val="22"/>
-        </w:rPr>
-        <w:t>…</w:t>
-      </w:r>
-      <w:r>
-        <w:rPr>
-          <w:rFonts w:ascii="Arial" w:eastAsia="Arial" w:hAnsi="Arial" w:cs="Arial"/>
-          <w:sz w:val="22"/>
-          <w:szCs w:val="22"/>
-        </w:rPr>
-        <w:t>……</w:t>
-      </w:r>
-      <w:r>
-        <w:rPr>
-          <w:rFonts w:ascii="Arial" w:eastAsia="Arial" w:hAnsi="Arial" w:cs="Arial"/>
-          <w:spacing w:val="-2"/>
-          <w:sz w:val="22"/>
-          <w:szCs w:val="22"/>
-        </w:rPr>
-        <w:t>…</w:t>
-      </w:r>
-      <w:r>
-        <w:rPr>
-          <w:rFonts w:ascii="Arial" w:eastAsia="Arial" w:hAnsi="Arial" w:cs="Arial"/>
-          <w:sz w:val="22"/>
-          <w:szCs w:val="22"/>
-        </w:rPr>
-        <w:t>………</w:t>
-      </w:r>
-      <w:r>
-        <w:rPr>
-          <w:rFonts w:ascii="Arial" w:eastAsia="Arial" w:hAnsi="Arial" w:cs="Arial"/>
-          <w:spacing w:val="-2"/>
-          <w:sz w:val="22"/>
-          <w:szCs w:val="22"/>
-        </w:rPr>
-        <w:t>…</w:t>
-      </w:r>
-      <w:r>
-        <w:rPr>
-          <w:rFonts w:ascii="Arial" w:eastAsia="Arial" w:hAnsi="Arial" w:cs="Arial"/>
-          <w:sz w:val="22"/>
-          <w:szCs w:val="22"/>
-        </w:rPr>
-        <w:t>………</w:t>
-      </w:r>
-      <w:r>
-        <w:rPr>
-          <w:rFonts w:ascii="Arial" w:eastAsia="Arial" w:hAnsi="Arial" w:cs="Arial"/>
-          <w:spacing w:val="-2"/>
-          <w:sz w:val="22"/>
-          <w:szCs w:val="22"/>
-        </w:rPr>
-        <w:t>…</w:t>
-      </w:r>
-      <w:r>
-        <w:rPr>
-          <w:rFonts w:ascii="Arial" w:eastAsia="Arial" w:hAnsi="Arial" w:cs="Arial"/>
-          <w:sz w:val="22"/>
-          <w:szCs w:val="22"/>
-        </w:rPr>
-        <w:t>……</w:t>
-      </w:r>
-      <w:r>
-        <w:rPr>
-          <w:rFonts w:ascii="Arial" w:eastAsia="Arial" w:hAnsi="Arial" w:cs="Arial"/>
-          <w:spacing w:val="-1"/>
-          <w:sz w:val="22"/>
-          <w:szCs w:val="22"/>
-        </w:rPr>
-        <w:t>.</w:t>
-      </w:r>
-      <w:r>
-        <w:rPr>
-          <w:rFonts w:ascii="Arial" w:eastAsia="Arial" w:hAnsi="Arial" w:cs="Arial"/>
-          <w:sz w:val="22"/>
-          <w:szCs w:val="22"/>
-        </w:rPr>
-        <w:t>.</w:t>
-      </w:r>
+      <w:proofErr w:type="gramEnd"/>
     </w:p>
     <w:p>
       <w:pPr>
@@ -4041,7 +4302,28 @@
           </w:tcPr>
           <w:p>
             <w:r>
-              <w:t>I integrated Chart.js into js/app.js (initCharts()), rendering real-time revenue vs. profit trend line graphs and payment method breakdown donut charts for business monitoring.</w:t>
+              <w:t>I integrated Chart.js into </w:t>
+            </w:r>
+            <w:proofErr w:type="spellStart"/>
+            <w:r>
+              <w:t>js</w:t>
+            </w:r>
+            <w:proofErr w:type="spellEnd"/>
+            <w:r>
+              <w:t>/app.js (</w:t>
+            </w:r>
+            <w:proofErr w:type="spellStart"/>
+            <w:proofErr w:type="gramStart"/>
+            <w:r>
+              <w:t>initCharts</w:t>
+            </w:r>
+            <w:proofErr w:type="spellEnd"/>
+            <w:r>
+              <w:t>(</w:t>
+            </w:r>
+            <w:proofErr w:type="gramEnd"/>
+            <w:r>
+              <w:t>)), rendering real-time revenue vs. profit trend line graphs and payment method breakdown donut charts for business monitoring.</w:t>
             </w:r>
           </w:p>
         </w:tc>
@@ -4264,7 +4546,41 @@
           </w:tcPr>
           <w:p>
             <w:r>
-              <w:t>I built the shopping cart engine in js/app.js (addToCart(), updateQty()), supporting quantity increments, item deletions, custom line-item discounts, and real-time subtotal calculations.</w:t>
+              <w:t>I built the shopping cart engine in </w:t>
+            </w:r>
+            <w:proofErr w:type="spellStart"/>
+            <w:r>
+              <w:t>js</w:t>
+            </w:r>
+            <w:proofErr w:type="spellEnd"/>
+            <w:r>
+              <w:t>/app.js (</w:t>
+            </w:r>
+            <w:proofErr w:type="spellStart"/>
+            <w:proofErr w:type="gramStart"/>
+            <w:r>
+              <w:t>addToCart</w:t>
+            </w:r>
+            <w:proofErr w:type="spellEnd"/>
+            <w:r>
+              <w:t>(</w:t>
+            </w:r>
+            <w:proofErr w:type="gramEnd"/>
+            <w:r>
+              <w:t>), </w:t>
+            </w:r>
+            <w:proofErr w:type="spellStart"/>
+            <w:proofErr w:type="gramStart"/>
+            <w:r>
+              <w:t>updateQty</w:t>
+            </w:r>
+            <w:proofErr w:type="spellEnd"/>
+            <w:r>
+              <w:t>(</w:t>
+            </w:r>
+            <w:proofErr w:type="gramEnd"/>
+            <w:r>
+              <w:t>)), supporting quantity increments, item deletions, custom line-item discounts, and real-time subtotal calculations.</w:t>
             </w:r>
           </w:p>
         </w:tc>
@@ -4366,7 +4682,20 @@
           </w:tcPr>
           <w:p>
             <w:r>
-              <w:t>I created multi-channel checkout processing (Cash with auto-change calculation, Card PDQ references, and Split Payments), held order queues (openHeldOrders()), and receipt generation logic.</w:t>
+              <w:t>I created multi-channel checkout processing (Cash with auto-change calculation, Card PDQ references, and Split Payments), held order queues (</w:t>
+            </w:r>
+            <w:proofErr w:type="spellStart"/>
+            <w:proofErr w:type="gramStart"/>
+            <w:r>
+              <w:t>openHeldOrders</w:t>
+            </w:r>
+            <w:proofErr w:type="spellEnd"/>
+            <w:r>
+              <w:t>(</w:t>
+            </w:r>
+            <w:proofErr w:type="gramEnd"/>
+            <w:r>
+              <w:t>)), and receipt generation logic.</w:t>
             </w:r>
           </w:p>
         </w:tc>
@@ -4480,7 +4809,11 @@
               <w:right w:val="single" w:sz="5" w:space="0" w:color="000000"/>
             </w:tcBorders>
           </w:tcPr>
-          <w:p/>
+          <w:p>
+            <w:r>
+              <w:t>I tested POS multi-channel payments across different screen resolutions, conducted held-order queue stress tests, and verified receipt print CSS styling.</w:t>
+            </w:r>
+          </w:p>
         </w:tc>
         <w:tc>
           <w:tcPr>
@@ -4504,7 +4837,11 @@
               <w:right w:val="single" w:sz="5" w:space="0" w:color="000000"/>
             </w:tcBorders>
           </w:tcPr>
-          <w:p/>
+          <w:p>
+            <w:r>
+              <w:t>Verifying print stylesheet rules ensured thermal receipts rendered cleanly across different browsers.</w:t>
+            </w:r>
+          </w:p>
         </w:tc>
       </w:tr>
     </w:tbl>
@@ -4952,7 +5289,16 @@
           <w:sz w:val="22"/>
           <w:szCs w:val="22"/>
         </w:rPr>
-        <w:t>……</w:t>
+        <w:t>…</w:t>
+      </w:r>
+      <w:proofErr w:type="gramStart"/>
+      <w:r>
+        <w:rPr>
+          <w:rFonts w:ascii="Arial" w:eastAsia="Arial" w:hAnsi="Arial" w:cs="Arial"/>
+          <w:sz w:val="22"/>
+          <w:szCs w:val="22"/>
+        </w:rPr>
+        <w:t>…</w:t>
       </w:r>
       <w:r>
         <w:rPr>
@@ -4971,6 +5317,7 @@
         </w:rPr>
         <w:t>.</w:t>
       </w:r>
+      <w:proofErr w:type="gramEnd"/>
     </w:p>
     <w:p>
       <w:pPr>
@@ -5126,7 +5473,29 @@
           <w:sz w:val="22"/>
           <w:szCs w:val="22"/>
         </w:rPr>
-        <w:t>A mistake I made during chart initialization was failing to call chart.destroy() when switching dashboard time filters (e.g., from Today to This Month). This caused Canvas overlap glitches where old chart tooltips lingered over new data. I fixed this by tracking active Chart.js instances in global state and explicitly destroying old instances before instantiating new charts.</w:t>
+        <w:t>A mistake I made during chart initialization was failing to call </w:t>
+      </w:r>
+      <w:proofErr w:type="spellStart"/>
+      <w:proofErr w:type="gramStart"/>
+      <w:r>
+        <w:rPr>
+          <w:rFonts w:ascii="Arial" w:eastAsia="Arial" w:hAnsi="Arial" w:cs="Arial"/>
+          <w:b/>
+          <w:sz w:val="22"/>
+          <w:szCs w:val="22"/>
+        </w:rPr>
+        <w:t>chart.destroy</w:t>
+      </w:r>
+      <w:proofErr w:type="spellEnd"/>
+      <w:proofErr w:type="gramEnd"/>
+      <w:r>
+        <w:rPr>
+          <w:rFonts w:ascii="Arial" w:eastAsia="Arial" w:hAnsi="Arial" w:cs="Arial"/>
+          <w:b/>
+          <w:sz w:val="22"/>
+          <w:szCs w:val="22"/>
+        </w:rPr>
+        <w:t>() when switching dashboard time filters (e.g., from Today to This Month). This caused Canvas overlap glitches where old chart tooltips lingered over new data. I fixed this by tracking active Chart.js instances in global state and explicitly destroying old instances before instantiating new charts.</w:t>
       </w:r>
     </w:p>
     <w:p>
@@ -5746,7 +6115,16 @@
           <w:sz w:val="22"/>
           <w:szCs w:val="22"/>
         </w:rPr>
-        <w:t>……</w:t>
+        <w:t>…</w:t>
+      </w:r>
+      <w:proofErr w:type="gramStart"/>
+      <w:r>
+        <w:rPr>
+          <w:rFonts w:ascii="Arial" w:eastAsia="Arial" w:hAnsi="Arial" w:cs="Arial"/>
+          <w:sz w:val="22"/>
+          <w:szCs w:val="22"/>
+        </w:rPr>
+        <w:t>…</w:t>
       </w:r>
       <w:r>
         <w:rPr>
@@ -5765,6 +6143,7 @@
         </w:rPr>
         <w:t>.</w:t>
       </w:r>
+      <w:proofErr w:type="gramEnd"/>
     </w:p>
     <w:p>
       <w:pPr>
@@ -6367,7 +6746,15 @@
           </w:tcPr>
           <w:p>
             <w:r>
-              <w:t>Writing parameterised SQLite queries ensured database safety against SQL injection.</w:t>
+              <w:t xml:space="preserve">Writing </w:t>
+            </w:r>
+            <w:proofErr w:type="spellStart"/>
+            <w:r>
+              <w:t>parameterised</w:t>
+            </w:r>
+            <w:proofErr w:type="spellEnd"/>
+            <w:r>
+              <w:t xml:space="preserve"> SQLite queries ensured database safety against SQL injection.</w:t>
             </w:r>
           </w:p>
         </w:tc>
@@ -6664,7 +7051,20 @@
           </w:tcPr>
           <w:p>
             <w:r>
-              <w:t>I built product search and multi-criteria filtering logic (filterInventory()), allowing managers to query items by category, keyword, status, or warehouse location.</w:t>
+              <w:t>I built product search and multi-criteria filtering logic (</w:t>
+            </w:r>
+            <w:proofErr w:type="spellStart"/>
+            <w:proofErr w:type="gramStart"/>
+            <w:r>
+              <w:t>filterInventory</w:t>
+            </w:r>
+            <w:proofErr w:type="spellEnd"/>
+            <w:r>
+              <w:t>(</w:t>
+            </w:r>
+            <w:proofErr w:type="gramEnd"/>
+            <w:r>
+              <w:t>)), allowing managers to query items by category, keyword, status, or warehouse location.</w:t>
             </w:r>
           </w:p>
         </w:tc>
@@ -6778,7 +7178,11 @@
               <w:right w:val="single" w:sz="5" w:space="0" w:color="000000"/>
             </w:tcBorders>
           </w:tcPr>
-          <w:p/>
+          <w:p>
+            <w:r>
+              <w:t>I conducted low-stock threshold alert tests, verified barcode scanner keyboard emulation inputs, and bug checked product editing modal form validations.</w:t>
+            </w:r>
+          </w:p>
         </w:tc>
         <w:tc>
           <w:tcPr>
@@ -6802,7 +7206,11 @@
               <w:right w:val="single" w:sz="5" w:space="0" w:color="000000"/>
             </w:tcBorders>
           </w:tcPr>
-          <w:p/>
+          <w:p>
+            <w:r>
+              <w:t>Testing hardware barcode inputs ensured cashiers could scan items without keyboard focus issues.</w:t>
+            </w:r>
+          </w:p>
         </w:tc>
       </w:tr>
     </w:tbl>
@@ -7250,7 +7658,16 @@
           <w:sz w:val="22"/>
           <w:szCs w:val="22"/>
         </w:rPr>
-        <w:t>……</w:t>
+        <w:t>…</w:t>
+      </w:r>
+      <w:proofErr w:type="gramStart"/>
+      <w:r>
+        <w:rPr>
+          <w:rFonts w:ascii="Arial" w:eastAsia="Arial" w:hAnsi="Arial" w:cs="Arial"/>
+          <w:sz w:val="22"/>
+          <w:szCs w:val="22"/>
+        </w:rPr>
+        <w:t>…</w:t>
       </w:r>
       <w:r>
         <w:rPr>
@@ -7269,6 +7686,7 @@
         </w:rPr>
         <w:t>.</w:t>
       </w:r>
+      <w:proofErr w:type="gramEnd"/>
     </w:p>
     <w:p>
       <w:pPr>
@@ -7463,40 +7881,111 @@
           <w:sz w:val="22"/>
           <w:szCs w:val="22"/>
         </w:rPr>
-        <w:t>Through this work, I strengthened my understanding of backend API design, data normalization, and client-side data caching strategies. I learned how to structure parameterised SQL queries in Node.js to safely update product quantities and maintain transactional integrity.</w:t>
-      </w:r>
-    </w:p>
-    <w:p>
-      <w:pPr>
-        <w:spacing w:before="24"/>
-        <w:ind w:left="600"/>
-        <w:rPr>
-          <w:rFonts w:ascii="Arial" w:eastAsia="Arial" w:hAnsi="Arial" w:cs="Arial"/>
-          <w:b/>
-          <w:sz w:val="22"/>
-          <w:szCs w:val="22"/>
-        </w:rPr>
-      </w:pPr>
-    </w:p>
-    <w:p>
-      <w:pPr>
-        <w:spacing w:before="24"/>
-        <w:ind w:left="600"/>
-        <w:rPr>
-          <w:rFonts w:ascii="Arial" w:eastAsia="Arial" w:hAnsi="Arial" w:cs="Arial"/>
-          <w:b/>
-          <w:sz w:val="22"/>
-          <w:szCs w:val="22"/>
-        </w:rPr>
-      </w:pPr>
-      <w:r>
-        <w:rPr>
-          <w:rFonts w:ascii="Arial" w:eastAsia="Arial" w:hAnsi="Arial" w:cs="Arial"/>
-          <w:b/>
-          <w:sz w:val="22"/>
-          <w:szCs w:val="22"/>
-        </w:rPr>
-        <w:t>One challenge I faced was handling floating-point arithmetic errors when computing profit margins (e.g., 0.1 + 0.2 = 0.30000000000000004). This resulted in messy decimal places on the UI. I resolved this issue by implementing a centralized formatting helper function (fmt()) using Math.round() to cleanly format currency and percentage values to two decimal places.</w:t>
+        <w:t xml:space="preserve">Through this work, I strengthened my understanding of backend API design, data normalization, and client-side data caching strategies. I learned how to structure </w:t>
+      </w:r>
+      <w:proofErr w:type="spellStart"/>
+      <w:r>
+        <w:rPr>
+          <w:rFonts w:ascii="Arial" w:eastAsia="Arial" w:hAnsi="Arial" w:cs="Arial"/>
+          <w:b/>
+          <w:sz w:val="22"/>
+          <w:szCs w:val="22"/>
+        </w:rPr>
+        <w:t>parameterised</w:t>
+      </w:r>
+      <w:proofErr w:type="spellEnd"/>
+      <w:r>
+        <w:rPr>
+          <w:rFonts w:ascii="Arial" w:eastAsia="Arial" w:hAnsi="Arial" w:cs="Arial"/>
+          <w:b/>
+          <w:sz w:val="22"/>
+          <w:szCs w:val="22"/>
+        </w:rPr>
+        <w:t xml:space="preserve"> SQL queries in Node.js to safely update product quantities and maintain transactional integrity.</w:t>
+      </w:r>
+    </w:p>
+    <w:p>
+      <w:pPr>
+        <w:spacing w:before="24"/>
+        <w:ind w:left="600"/>
+        <w:rPr>
+          <w:rFonts w:ascii="Arial" w:eastAsia="Arial" w:hAnsi="Arial" w:cs="Arial"/>
+          <w:b/>
+          <w:sz w:val="22"/>
+          <w:szCs w:val="22"/>
+        </w:rPr>
+      </w:pPr>
+    </w:p>
+    <w:p>
+      <w:pPr>
+        <w:spacing w:before="24"/>
+        <w:ind w:left="600"/>
+        <w:rPr>
+          <w:rFonts w:ascii="Arial" w:eastAsia="Arial" w:hAnsi="Arial" w:cs="Arial"/>
+          <w:b/>
+          <w:sz w:val="22"/>
+          <w:szCs w:val="22"/>
+        </w:rPr>
+      </w:pPr>
+      <w:r>
+        <w:rPr>
+          <w:rFonts w:ascii="Arial" w:eastAsia="Arial" w:hAnsi="Arial" w:cs="Arial"/>
+          <w:b/>
+          <w:sz w:val="22"/>
+          <w:szCs w:val="22"/>
+        </w:rPr>
+        <w:t>One challenge I faced was handling floating-point arithmetic errors when computing profit margins (e.g., 0.1 + 0.2 = 0.30000000000000004). This resulted in messy decimal places on the UI. I resolved this issue by implementing a centralized formatting helper function (</w:t>
+      </w:r>
+      <w:proofErr w:type="spellStart"/>
+      <w:proofErr w:type="gramStart"/>
+      <w:r>
+        <w:rPr>
+          <w:rFonts w:ascii="Arial" w:eastAsia="Arial" w:hAnsi="Arial" w:cs="Arial"/>
+          <w:b/>
+          <w:sz w:val="22"/>
+          <w:szCs w:val="22"/>
+        </w:rPr>
+        <w:t>fmt</w:t>
+      </w:r>
+      <w:proofErr w:type="spellEnd"/>
+      <w:r>
+        <w:rPr>
+          <w:rFonts w:ascii="Arial" w:eastAsia="Arial" w:hAnsi="Arial" w:cs="Arial"/>
+          <w:b/>
+          <w:sz w:val="22"/>
+          <w:szCs w:val="22"/>
+        </w:rPr>
+        <w:t>(</w:t>
+      </w:r>
+      <w:proofErr w:type="gramEnd"/>
+      <w:r>
+        <w:rPr>
+          <w:rFonts w:ascii="Arial" w:eastAsia="Arial" w:hAnsi="Arial" w:cs="Arial"/>
+          <w:b/>
+          <w:sz w:val="22"/>
+          <w:szCs w:val="22"/>
+        </w:rPr>
+        <w:t>)) using </w:t>
+      </w:r>
+      <w:proofErr w:type="spellStart"/>
+      <w:r>
+        <w:rPr>
+          <w:rFonts w:ascii="Arial" w:eastAsia="Arial" w:hAnsi="Arial" w:cs="Arial"/>
+          <w:b/>
+          <w:sz w:val="22"/>
+          <w:szCs w:val="22"/>
+        </w:rPr>
+        <w:t>Math.round</w:t>
+      </w:r>
+      <w:proofErr w:type="spellEnd"/>
+      <w:r>
+        <w:rPr>
+          <w:rFonts w:ascii="Arial" w:eastAsia="Arial" w:hAnsi="Arial" w:cs="Arial"/>
+          <w:b/>
+          <w:sz w:val="22"/>
+          <w:szCs w:val="22"/>
+        </w:rPr>
+        <w:t>() to cleanly format currency and percentage values to two decimal places.</w:t>
       </w:r>
     </w:p>
     <w:p>
@@ -8068,7 +8557,16 @@
           <w:sz w:val="22"/>
           <w:szCs w:val="22"/>
         </w:rPr>
-        <w:t>……</w:t>
+        <w:t>…</w:t>
+      </w:r>
+      <w:proofErr w:type="gramStart"/>
+      <w:r>
+        <w:rPr>
+          <w:rFonts w:ascii="Arial" w:eastAsia="Arial" w:hAnsi="Arial" w:cs="Arial"/>
+          <w:sz w:val="22"/>
+          <w:szCs w:val="22"/>
+        </w:rPr>
+        <w:t>…</w:t>
       </w:r>
       <w:r>
         <w:rPr>
@@ -8087,6 +8585,7 @@
         </w:rPr>
         <w:t>.</w:t>
       </w:r>
+      <w:proofErr w:type="gramEnd"/>
     </w:p>
     <w:p>
       <w:pPr>
@@ -9099,7 +9598,11 @@
               <w:right w:val="single" w:sz="5" w:space="0" w:color="000000"/>
             </w:tcBorders>
           </w:tcPr>
-          <w:p/>
+          <w:p>
+            <w:r>
+              <w:t>I audited stock movement ledger records for data consistency, tested non-inventory service items during checkout, and verified audit trail timestamps.</w:t>
+            </w:r>
+          </w:p>
         </w:tc>
         <w:tc>
           <w:tcPr>
@@ -9123,7 +9626,11 @@
               <w:right w:val="single" w:sz="5" w:space="0" w:color="000000"/>
             </w:tcBorders>
           </w:tcPr>
-          <w:p/>
+          <w:p>
+            <w:r>
+              <w:t>Validating ledger consistency ensured inventory shrinkage records remained accurate and immutable.</w:t>
+            </w:r>
+          </w:p>
         </w:tc>
       </w:tr>
     </w:tbl>
@@ -9571,7 +10078,16 @@
           <w:sz w:val="22"/>
           <w:szCs w:val="22"/>
         </w:rPr>
-        <w:t>……</w:t>
+        <w:t>…</w:t>
+      </w:r>
+      <w:proofErr w:type="gramStart"/>
+      <w:r>
+        <w:rPr>
+          <w:rFonts w:ascii="Arial" w:eastAsia="Arial" w:hAnsi="Arial" w:cs="Arial"/>
+          <w:sz w:val="22"/>
+          <w:szCs w:val="22"/>
+        </w:rPr>
+        <w:t>…</w:t>
       </w:r>
       <w:r>
         <w:rPr>
@@ -9590,6 +10106,7 @@
         </w:rPr>
         <w:t>.</w:t>
       </w:r>
+      <w:proofErr w:type="gramEnd"/>
     </w:p>
     <w:p>
       <w:pPr>
@@ -9822,14 +10339,45 @@
           <w:szCs w:val="22"/>
         </w:rPr>
       </w:pPr>
-      <w:r>
-        <w:rPr>
-          <w:rFonts w:ascii="Arial" w:eastAsia="Arial" w:hAnsi="Arial" w:cs="Arial"/>
-          <w:b/>
-          <w:sz w:val="22"/>
-          <w:szCs w:val="22"/>
-        </w:rPr>
-        <w:t>A initial mistake occurred when processing service items at checkout: the POS checkout engine attempted to decrement product stock levels for service items, causing foreign key constraint failures. I corrected this by adding an item type flag (is_service) in the cart payload to bypass stock decrement queries for billable services.</w:t>
+      <w:proofErr w:type="gramStart"/>
+      <w:r>
+        <w:rPr>
+          <w:rFonts w:ascii="Arial" w:eastAsia="Arial" w:hAnsi="Arial" w:cs="Arial"/>
+          <w:b/>
+          <w:sz w:val="22"/>
+          <w:szCs w:val="22"/>
+        </w:rPr>
+        <w:t>A</w:t>
+      </w:r>
+      <w:proofErr w:type="gramEnd"/>
+      <w:r>
+        <w:rPr>
+          <w:rFonts w:ascii="Arial" w:eastAsia="Arial" w:hAnsi="Arial" w:cs="Arial"/>
+          <w:b/>
+          <w:sz w:val="22"/>
+          <w:szCs w:val="22"/>
+        </w:rPr>
+        <w:t xml:space="preserve"> initial mistake occurred when processing service items at checkout: the POS checkout engine attempted to decrement product stock levels for service items, causing foreign key constraint failures. I corrected this by adding an item type flag (</w:t>
+      </w:r>
+      <w:proofErr w:type="spellStart"/>
+      <w:r>
+        <w:rPr>
+          <w:rFonts w:ascii="Arial" w:eastAsia="Arial" w:hAnsi="Arial" w:cs="Arial"/>
+          <w:b/>
+          <w:sz w:val="22"/>
+          <w:szCs w:val="22"/>
+        </w:rPr>
+        <w:t>is_service</w:t>
+      </w:r>
+      <w:proofErr w:type="spellEnd"/>
+      <w:r>
+        <w:rPr>
+          <w:rFonts w:ascii="Arial" w:eastAsia="Arial" w:hAnsi="Arial" w:cs="Arial"/>
+          <w:b/>
+          <w:sz w:val="22"/>
+          <w:szCs w:val="22"/>
+        </w:rPr>
+        <w:t>) in the cart payload to bypass stock decrement queries for billable services.</w:t>
       </w:r>
     </w:p>
     <w:p>
@@ -10377,7 +10925,16 @@
           <w:sz w:val="22"/>
           <w:szCs w:val="22"/>
         </w:rPr>
-        <w:t>……</w:t>
+        <w:t>…</w:t>
+      </w:r>
+      <w:proofErr w:type="gramStart"/>
+      <w:r>
+        <w:rPr>
+          <w:rFonts w:ascii="Arial" w:eastAsia="Arial" w:hAnsi="Arial" w:cs="Arial"/>
+          <w:sz w:val="22"/>
+          <w:szCs w:val="22"/>
+        </w:rPr>
+        <w:t>…</w:t>
       </w:r>
       <w:r>
         <w:rPr>
@@ -10396,6 +10953,7 @@
         </w:rPr>
         <w:t>.</w:t>
       </w:r>
+      <w:proofErr w:type="gramEnd"/>
     </w:p>
     <w:p>
       <w:pPr>
@@ -11409,7 +11967,11 @@
               <w:right w:val="single" w:sz="5" w:space="0" w:color="000000"/>
             </w:tcBorders>
           </w:tcPr>
-          <w:p/>
+          <w:p>
+            <w:r>
+              <w:t>I tested hire purchase installment calculations under edge-case down payment amounts, verified supplier CSV data exports, and checked customer debt aging updates.</w:t>
+            </w:r>
+          </w:p>
         </w:tc>
         <w:tc>
           <w:tcPr>
@@ -11433,7 +11995,11 @@
               <w:right w:val="single" w:sz="5" w:space="0" w:color="000000"/>
             </w:tcBorders>
           </w:tcPr>
-          <w:p/>
+          <w:p>
+            <w:r>
+              <w:t>Running edge-case installment tests confirmed the credit accounting logic handled rounding properly.</w:t>
+            </w:r>
+          </w:p>
         </w:tc>
       </w:tr>
     </w:tbl>
@@ -11881,7 +12447,16 @@
           <w:sz w:val="22"/>
           <w:szCs w:val="22"/>
         </w:rPr>
-        <w:t>……</w:t>
+        <w:t>…</w:t>
+      </w:r>
+      <w:proofErr w:type="gramStart"/>
+      <w:r>
+        <w:rPr>
+          <w:rFonts w:ascii="Arial" w:eastAsia="Arial" w:hAnsi="Arial" w:cs="Arial"/>
+          <w:sz w:val="22"/>
+          <w:szCs w:val="22"/>
+        </w:rPr>
+        <w:t>…</w:t>
       </w:r>
       <w:r>
         <w:rPr>
@@ -11900,6 +12475,7 @@
         </w:rPr>
         <w:t>.</w:t>
       </w:r>
+      <w:proofErr w:type="gramEnd"/>
     </w:p>
     <w:p>
       <w:pPr>
@@ -12103,7 +12679,27 @@
           <w:sz w:val="22"/>
           <w:szCs w:val="22"/>
         </w:rPr>
-        <w:t>A challenge I encountered was maintaining sync between customer credit balances and sales transactions. When a credit sale was completed, the customer's total balance owed wasn't updating automatically in the receivables ledger. I fixed this by adding database transaction hooks in salesController.js that automatically update customer balance fields whenever a credit purchase or payment is recorded.</w:t>
+        <w:t xml:space="preserve">A challenge I encountered was maintaining sync between customer credit balances and sales transactions. When a credit sale was completed, the customer's total balance owed wasn't updating automatically in the </w:t>
+      </w:r>
+      <w:proofErr w:type="gramStart"/>
+      <w:r>
+        <w:rPr>
+          <w:rFonts w:ascii="Arial" w:eastAsia="Arial" w:hAnsi="Arial" w:cs="Arial"/>
+          <w:b/>
+          <w:sz w:val="22"/>
+          <w:szCs w:val="22"/>
+        </w:rPr>
+        <w:t>receivables</w:t>
+      </w:r>
+      <w:proofErr w:type="gramEnd"/>
+      <w:r>
+        <w:rPr>
+          <w:rFonts w:ascii="Arial" w:eastAsia="Arial" w:hAnsi="Arial" w:cs="Arial"/>
+          <w:b/>
+          <w:sz w:val="22"/>
+          <w:szCs w:val="22"/>
+        </w:rPr>
+        <w:t xml:space="preserve"> ledger. I fixed this by adding database transaction hooks in salesController.js that automatically update customer balance fields whenever a credit purchase or payment is recorded.</w:t>
       </w:r>
     </w:p>
     <w:p>
@@ -12687,7 +13283,16 @@
           <w:sz w:val="22"/>
           <w:szCs w:val="22"/>
         </w:rPr>
-        <w:t>……</w:t>
+        <w:t>…</w:t>
+      </w:r>
+      <w:proofErr w:type="gramStart"/>
+      <w:r>
+        <w:rPr>
+          <w:rFonts w:ascii="Arial" w:eastAsia="Arial" w:hAnsi="Arial" w:cs="Arial"/>
+          <w:sz w:val="22"/>
+          <w:szCs w:val="22"/>
+        </w:rPr>
+        <w:t>…</w:t>
       </w:r>
       <w:r>
         <w:rPr>
@@ -12706,6 +13311,7 @@
         </w:rPr>
         <w:t>.</w:t>
       </w:r>
+      <w:proofErr w:type="gramEnd"/>
     </w:p>
     <w:p>
       <w:pPr>
@@ -13395,7 +14001,28 @@
           </w:tcPr>
           <w:p>
             <w:r>
-              <w:t>I performed a comprehensive security audit of the application, created a .gitignore file to protect .env secrets, and generated cryptographically strong 64-byte JWT secrets.</w:t>
+              <w:t xml:space="preserve">I performed a comprehensive security audit of the application, created </w:t>
+            </w:r>
+            <w:proofErr w:type="gramStart"/>
+            <w:r>
+              <w:t>a .</w:t>
+            </w:r>
+            <w:proofErr w:type="spellStart"/>
+            <w:r>
+              <w:t>gitignore</w:t>
+            </w:r>
+            <w:proofErr w:type="spellEnd"/>
+            <w:proofErr w:type="gramEnd"/>
+            <w:r>
+              <w:t xml:space="preserve"> file to </w:t>
+            </w:r>
+            <w:proofErr w:type="gramStart"/>
+            <w:r>
+              <w:t>protect .env</w:t>
+            </w:r>
+            <w:proofErr w:type="gramEnd"/>
+            <w:r>
+              <w:t> secrets, and generated cryptographically strong 64-byte JWT secrets.</w:t>
             </w:r>
           </w:p>
         </w:tc>
@@ -13719,7 +14346,11 @@
               <w:right w:val="single" w:sz="5" w:space="0" w:color="000000"/>
             </w:tcBorders>
           </w:tcPr>
-          <w:p/>
+          <w:p>
+            <w:r>
+              <w:t>I conducted security penetration tests on auth rate limiting, tested bulk CSV imports with corrupted sample rows, and verified Z-report end-of-day print layouts.</w:t>
+            </w:r>
+          </w:p>
         </w:tc>
         <w:tc>
           <w:tcPr>
@@ -13743,7 +14374,11 @@
               <w:right w:val="single" w:sz="5" w:space="0" w:color="000000"/>
             </w:tcBorders>
           </w:tcPr>
-          <w:p/>
+          <w:p>
+            <w:r>
+              <w:t>Stress testing the bulk uploader with invalid CSV rows ensured error handling failed gracefully.</w:t>
+            </w:r>
+          </w:p>
         </w:tc>
       </w:tr>
     </w:tbl>
@@ -14191,7 +14826,16 @@
           <w:sz w:val="22"/>
           <w:szCs w:val="22"/>
         </w:rPr>
-        <w:t>……</w:t>
+        <w:t>…</w:t>
+      </w:r>
+      <w:proofErr w:type="gramStart"/>
+      <w:r>
+        <w:rPr>
+          <w:rFonts w:ascii="Arial" w:eastAsia="Arial" w:hAnsi="Arial" w:cs="Arial"/>
+          <w:sz w:val="22"/>
+          <w:szCs w:val="22"/>
+        </w:rPr>
+        <w:t>…</w:t>
       </w:r>
       <w:r>
         <w:rPr>
@@ -14210,6 +14854,7 @@
         </w:rPr>
         <w:t>.</w:t>
       </w:r>
+      <w:proofErr w:type="gramEnd"/>
     </w:p>
     <w:p>
       <w:pPr>
@@ -14536,40 +15181,120 @@
           <w:sz w:val="22"/>
           <w:szCs w:val="22"/>
         </w:rPr>
-        <w:t>I learned critical cybersecurity practices for Node.js backends, including rate-limiting login attempts to prevent brute-force attacks, creating Role-Based Access Control (RBAC) middleware (requireRole), locking down CORS to allowed origins, and masking internal error stack traces in production (NODE_ENV=production).</w:t>
-      </w:r>
-    </w:p>
-    <w:p>
-      <w:pPr>
-        <w:spacing w:before="24"/>
-        <w:ind w:left="600"/>
-        <w:rPr>
-          <w:rFonts w:ascii="Arial" w:eastAsia="Arial" w:hAnsi="Arial" w:cs="Arial"/>
-          <w:b/>
-          <w:sz w:val="22"/>
-          <w:szCs w:val="22"/>
-        </w:rPr>
-      </w:pPr>
-    </w:p>
-    <w:p>
-      <w:pPr>
-        <w:spacing w:before="24"/>
-        <w:ind w:left="600"/>
-        <w:rPr>
-          <w:rFonts w:ascii="Arial" w:eastAsia="Arial" w:hAnsi="Arial" w:cs="Arial"/>
-          <w:b/>
-          <w:sz w:val="22"/>
-          <w:szCs w:val="22"/>
-        </w:rPr>
-      </w:pPr>
-      <w:r>
-        <w:rPr>
-          <w:rFonts w:ascii="Arial" w:eastAsia="Arial" w:hAnsi="Arial" w:cs="Arial"/>
-          <w:b/>
-          <w:sz w:val="22"/>
-          <w:szCs w:val="22"/>
-        </w:rPr>
-        <w:t>A major security vulnerability I discovered during the audit was that the Google Gemini AI endpoints (/api/ai/chat and /api/ai/insights) had no authentication middleware attached, leaving API quotas exposed to public unauthenticated requests. I immediately fixed this by securing all AI routes with the requireAuth JWT middleware.</w:t>
+        <w:t>I learned critical cybersecurity practices for Node.js backends, including rate-limiting login attempts to prevent brute-force attacks, creating Role-Based Access Control (RBAC) middleware (</w:t>
+      </w:r>
+      <w:proofErr w:type="spellStart"/>
+      <w:r>
+        <w:rPr>
+          <w:rFonts w:ascii="Arial" w:eastAsia="Arial" w:hAnsi="Arial" w:cs="Arial"/>
+          <w:b/>
+          <w:sz w:val="22"/>
+          <w:szCs w:val="22"/>
+        </w:rPr>
+        <w:t>requireRole</w:t>
+      </w:r>
+      <w:proofErr w:type="spellEnd"/>
+      <w:r>
+        <w:rPr>
+          <w:rFonts w:ascii="Arial" w:eastAsia="Arial" w:hAnsi="Arial" w:cs="Arial"/>
+          <w:b/>
+          <w:sz w:val="22"/>
+          <w:szCs w:val="22"/>
+        </w:rPr>
+        <w:t>), locking down CORS to allowed origins, and masking internal error stack traces in production (NODE_ENV=production).</w:t>
+      </w:r>
+    </w:p>
+    <w:p>
+      <w:pPr>
+        <w:spacing w:before="24"/>
+        <w:ind w:left="600"/>
+        <w:rPr>
+          <w:rFonts w:ascii="Arial" w:eastAsia="Arial" w:hAnsi="Arial" w:cs="Arial"/>
+          <w:b/>
+          <w:sz w:val="22"/>
+          <w:szCs w:val="22"/>
+        </w:rPr>
+      </w:pPr>
+    </w:p>
+    <w:p>
+      <w:pPr>
+        <w:spacing w:before="24"/>
+        <w:ind w:left="600"/>
+        <w:rPr>
+          <w:rFonts w:ascii="Arial" w:eastAsia="Arial" w:hAnsi="Arial" w:cs="Arial"/>
+          <w:b/>
+          <w:sz w:val="22"/>
+          <w:szCs w:val="22"/>
+        </w:rPr>
+      </w:pPr>
+      <w:r>
+        <w:rPr>
+          <w:rFonts w:ascii="Arial" w:eastAsia="Arial" w:hAnsi="Arial" w:cs="Arial"/>
+          <w:b/>
+          <w:sz w:val="22"/>
+          <w:szCs w:val="22"/>
+        </w:rPr>
+        <w:t>A major security vulnerability I discovered during the audit was that the Google Gemini AI endpoints (/</w:t>
+      </w:r>
+      <w:proofErr w:type="spellStart"/>
+      <w:r>
+        <w:rPr>
+          <w:rFonts w:ascii="Arial" w:eastAsia="Arial" w:hAnsi="Arial" w:cs="Arial"/>
+          <w:b/>
+          <w:sz w:val="22"/>
+          <w:szCs w:val="22"/>
+        </w:rPr>
+        <w:t>api</w:t>
+      </w:r>
+      <w:proofErr w:type="spellEnd"/>
+      <w:r>
+        <w:rPr>
+          <w:rFonts w:ascii="Arial" w:eastAsia="Arial" w:hAnsi="Arial" w:cs="Arial"/>
+          <w:b/>
+          <w:sz w:val="22"/>
+          <w:szCs w:val="22"/>
+        </w:rPr>
+        <w:t>/ai/chat and /</w:t>
+      </w:r>
+      <w:proofErr w:type="spellStart"/>
+      <w:r>
+        <w:rPr>
+          <w:rFonts w:ascii="Arial" w:eastAsia="Arial" w:hAnsi="Arial" w:cs="Arial"/>
+          <w:b/>
+          <w:sz w:val="22"/>
+          <w:szCs w:val="22"/>
+        </w:rPr>
+        <w:t>api</w:t>
+      </w:r>
+      <w:proofErr w:type="spellEnd"/>
+      <w:r>
+        <w:rPr>
+          <w:rFonts w:ascii="Arial" w:eastAsia="Arial" w:hAnsi="Arial" w:cs="Arial"/>
+          <w:b/>
+          <w:sz w:val="22"/>
+          <w:szCs w:val="22"/>
+        </w:rPr>
+        <w:t>/ai/insights) had no authentication middleware attached, leaving API quotas exposed to public unauthenticated requests. I immediately fixed this by securing all AI routes with the </w:t>
+      </w:r>
+      <w:proofErr w:type="spellStart"/>
+      <w:r>
+        <w:rPr>
+          <w:rFonts w:ascii="Arial" w:eastAsia="Arial" w:hAnsi="Arial" w:cs="Arial"/>
+          <w:b/>
+          <w:sz w:val="22"/>
+          <w:szCs w:val="22"/>
+        </w:rPr>
+        <w:t>requireAuth</w:t>
+      </w:r>
+      <w:proofErr w:type="spellEnd"/>
+      <w:r>
+        <w:rPr>
+          <w:rFonts w:ascii="Arial" w:eastAsia="Arial" w:hAnsi="Arial" w:cs="Arial"/>
+          <w:b/>
+          <w:sz w:val="22"/>
+          <w:szCs w:val="22"/>
+        </w:rPr>
+        <w:t> JWT middleware.</w:t>
       </w:r>
     </w:p>
     <w:p>
@@ -15008,7 +15733,16 @@
           <w:sz w:val="22"/>
           <w:szCs w:val="22"/>
         </w:rPr>
-        <w:t>……</w:t>
+        <w:t>…</w:t>
+      </w:r>
+      <w:proofErr w:type="gramStart"/>
+      <w:r>
+        <w:rPr>
+          <w:rFonts w:ascii="Arial" w:eastAsia="Arial" w:hAnsi="Arial" w:cs="Arial"/>
+          <w:sz w:val="22"/>
+          <w:szCs w:val="22"/>
+        </w:rPr>
+        <w:t>…</w:t>
       </w:r>
       <w:r>
         <w:rPr>
@@ -15027,6 +15761,7 @@
         </w:rPr>
         <w:t>.</w:t>
       </w:r>
+      <w:proofErr w:type="gramEnd"/>
     </w:p>
     <w:p>
       <w:pPr>
@@ -15823,7 +16558,28 @@
           </w:tcPr>
           <w:p>
             <w:r>
-              <w:t>I updated role-based view permissions in js/app.js (applyRolePermissions()), restricting Cashiers from accessing Executive Dashboards and redirecting Cashier logins to the POS Sales Terminal.</w:t>
+              <w:t>I updated role-based view permissions in </w:t>
+            </w:r>
+            <w:proofErr w:type="spellStart"/>
+            <w:r>
+              <w:t>js</w:t>
+            </w:r>
+            <w:proofErr w:type="spellEnd"/>
+            <w:r>
+              <w:t>/app.js (</w:t>
+            </w:r>
+            <w:proofErr w:type="spellStart"/>
+            <w:proofErr w:type="gramStart"/>
+            <w:r>
+              <w:t>applyRolePermissions</w:t>
+            </w:r>
+            <w:proofErr w:type="spellEnd"/>
+            <w:r>
+              <w:t>(</w:t>
+            </w:r>
+            <w:proofErr w:type="gramEnd"/>
+            <w:r>
+              <w:t>)), restricting Cashiers from accessing Executive Dashboards and redirecting Cashier logins to the POS Sales Terminal.</w:t>
             </w:r>
           </w:p>
         </w:tc>
@@ -15925,7 +16681,15 @@
           </w:tcPr>
           <w:p>
             <w:r>
-              <w:t>I optimized POS category filtering using .includes() substring matching and overhauled the Sales History view into an in-app modal with itemized receipt breakdowns and CSV export.</w:t>
+              <w:t xml:space="preserve">I optimized POS category filtering </w:t>
+            </w:r>
+            <w:proofErr w:type="gramStart"/>
+            <w:r>
+              <w:t>using .includes</w:t>
+            </w:r>
+            <w:proofErr w:type="gramEnd"/>
+            <w:r>
+              <w:t>() substring matching and overhauled the Sales History view into an in-app modal with itemized receipt breakdowns and CSV export.</w:t>
             </w:r>
           </w:p>
         </w:tc>
@@ -16039,7 +16803,11 @@
               <w:right w:val="single" w:sz="5" w:space="0" w:color="000000"/>
             </w:tcBorders>
           </w:tcPr>
-          <w:p/>
+          <w:p>
+            <w:r>
+              <w:t>I tested Leaflet delivery route mapping on responsive mobile viewports, verified Gemini AI assistant fallback responses during network errors, and audited role view access.</w:t>
+            </w:r>
+          </w:p>
         </w:tc>
         <w:tc>
           <w:tcPr>
@@ -16063,7 +16831,11 @@
               <w:right w:val="single" w:sz="5" w:space="0" w:color="000000"/>
             </w:tcBorders>
           </w:tcPr>
-          <w:p/>
+          <w:p>
+            <w:r>
+              <w:t>Adding offline fallback handlers ensured the AI assistant displayed helpful error banners when disconnected.</w:t>
+            </w:r>
+          </w:p>
         </w:tc>
       </w:tr>
     </w:tbl>
@@ -16511,7 +17283,16 @@
           <w:sz w:val="22"/>
           <w:szCs w:val="22"/>
         </w:rPr>
-        <w:t>……</w:t>
+        <w:t>…</w:t>
+      </w:r>
+      <w:proofErr w:type="gramStart"/>
+      <w:r>
+        <w:rPr>
+          <w:rFonts w:ascii="Arial" w:eastAsia="Arial" w:hAnsi="Arial" w:cs="Arial"/>
+          <w:sz w:val="22"/>
+          <w:szCs w:val="22"/>
+        </w:rPr>
+        <w:t>…</w:t>
       </w:r>
       <w:r>
         <w:rPr>
@@ -16530,6 +17311,7 @@
         </w:rPr>
         <w:t>.</w:t>
       </w:r>
+      <w:proofErr w:type="gramEnd"/>
     </w:p>
     <w:p>
       <w:pPr>
@@ -16685,7 +17467,27 @@
           <w:sz w:val="22"/>
           <w:szCs w:val="22"/>
         </w:rPr>
-        <w:t>A bug I fixed on Friday was in the POS category filtering system: category buttons passed short keys (e.g., "food"), whereas database products stored full names (e.g., "food &amp; beverage"). Strict equality checking (===) resulted in zero matching products. I resolved this by updating the filter to use .includes() substring matching, restoring correct product filtering across all category tabs.</w:t>
+        <w:t xml:space="preserve">A bug I fixed on Friday was in the POS category filtering system: category buttons passed short keys (e.g., "food"), whereas database products stored full names (e.g., "food &amp; beverage"). Strict equality checking (===) resulted in zero matching products. I resolved this by updating the filter to </w:t>
+      </w:r>
+      <w:proofErr w:type="gramStart"/>
+      <w:r>
+        <w:rPr>
+          <w:rFonts w:ascii="Arial" w:eastAsia="Arial" w:hAnsi="Arial" w:cs="Arial"/>
+          <w:b/>
+          <w:sz w:val="22"/>
+          <w:szCs w:val="22"/>
+        </w:rPr>
+        <w:t>use .includes</w:t>
+      </w:r>
+      <w:proofErr w:type="gramEnd"/>
+      <w:r>
+        <w:rPr>
+          <w:rFonts w:ascii="Arial" w:eastAsia="Arial" w:hAnsi="Arial" w:cs="Arial"/>
+          <w:b/>
+          <w:sz w:val="22"/>
+          <w:szCs w:val="22"/>
+        </w:rPr>
+        <w:t>() substring matching, restoring correct product filtering across all category tabs.</w:t>
       </w:r>
     </w:p>
     <w:p>
@@ -17328,7 +18130,16 @@
           <w:sz w:val="22"/>
           <w:szCs w:val="22"/>
         </w:rPr>
-        <w:t>……</w:t>
+        <w:t>…</w:t>
+      </w:r>
+      <w:proofErr w:type="gramStart"/>
+      <w:r>
+        <w:rPr>
+          <w:rFonts w:ascii="Arial" w:eastAsia="Arial" w:hAnsi="Arial" w:cs="Arial"/>
+          <w:sz w:val="22"/>
+          <w:szCs w:val="22"/>
+        </w:rPr>
+        <w:t>…</w:t>
       </w:r>
       <w:r>
         <w:rPr>
@@ -17347,6 +18158,7 @@
         </w:rPr>
         <w:t>.</w:t>
       </w:r>
+      <w:proofErr w:type="gramEnd"/>
     </w:p>
     <w:p>
       <w:pPr>
@@ -17811,7 +18623,11 @@
               <w:right w:val="single" w:sz="5" w:space="0" w:color="000000"/>
             </w:tcBorders>
           </w:tcPr>
-          <w:p/>
+          <w:p>
+            <w:r>
+              <w:t>I added password visibility eye toggles on login and staff modals, restricted branch creation to Owner in Settings, and synced all-branch Dashboard KPI cards with active date filters.</w:t>
+            </w:r>
+          </w:p>
         </w:tc>
         <w:tc>
           <w:tcPr>
@@ -17835,7 +18651,11 @@
               <w:right w:val="single" w:sz="5" w:space="0" w:color="000000"/>
             </w:tcBorders>
           </w:tcPr>
-          <w:p/>
+          <w:p>
+            <w:r>
+              <w:t>Adding password visibility improved login UX while branch creation restrictions strengthened system RBAC.</w:t>
+            </w:r>
+          </w:p>
         </w:tc>
       </w:tr>
       <w:tr>
@@ -17911,7 +18731,11 @@
               <w:right w:val="single" w:sz="5" w:space="0" w:color="000000"/>
             </w:tcBorders>
           </w:tcPr>
-          <w:p/>
+          <w:p>
+            <w:r>
+              <w:t>I built the multi-branch Branch Comparison time filter (#comp-period-select) and refactored HR Management into its own dedicated standalone navigation view with enterprise branch filtering.</w:t>
+            </w:r>
+          </w:p>
         </w:tc>
         <w:tc>
           <w:tcPr>
@@ -17935,7 +18759,11 @@
               <w:right w:val="single" w:sz="5" w:space="0" w:color="000000"/>
             </w:tcBorders>
           </w:tcPr>
-          <w:p/>
+          <w:p>
+            <w:r>
+              <w:t>Isolating HR as a standalone module streamlined multi-branch staff oversight.</w:t>
+            </w:r>
+          </w:p>
         </w:tc>
       </w:tr>
       <w:tr>
@@ -18018,7 +18846,11 @@
               <w:right w:val="single" w:sz="5" w:space="0" w:color="000000"/>
             </w:tcBorders>
           </w:tcPr>
-          <w:p/>
+          <w:p>
+            <w:r>
+              <w:t>I integrated the POS terminal Clock-In/Clock-Out widget (#terminal-clock-widget), removed legacy manual attendance across branches, and automated shift differentials and overtime tracking.</w:t>
+            </w:r>
+          </w:p>
         </w:tc>
         <w:tc>
           <w:tcPr>
@@ -18042,7 +18874,11 @@
               <w:right w:val="single" w:sz="5" w:space="0" w:color="000000"/>
             </w:tcBorders>
           </w:tcPr>
-          <w:p/>
+          <w:p>
+            <w:r>
+              <w:t>Direct POS terminal clocking automated shift tracking and eliminated manual attendance logging.</w:t>
+            </w:r>
+          </w:p>
         </w:tc>
       </w:tr>
       <w:tr>
@@ -18118,7 +18954,11 @@
               <w:right w:val="single" w:sz="5" w:space="0" w:color="000000"/>
             </w:tcBorders>
           </w:tcPr>
-          <w:p/>
+          <w:p>
+            <w:r>
+              <w:t>I implemented sales-driven commission calculations from cashier attribution, statutory tax deductions (PAYE, NSSF, NHIF), and register shift cash shortage deductions.</w:t>
+            </w:r>
+          </w:p>
         </w:tc>
         <w:tc>
           <w:tcPr>
@@ -18142,7 +18982,11 @@
               <w:right w:val="single" w:sz="5" w:space="0" w:color="000000"/>
             </w:tcBorders>
           </w:tcPr>
-          <w:p/>
+          <w:p>
+            <w:r>
+              <w:t>Linking commissions to cashier sales motivated staff while automated shortage deductions ensured drawer balance.</w:t>
+            </w:r>
+          </w:p>
         </w:tc>
       </w:tr>
       <w:tr>
@@ -18212,7 +19056,27 @@
               <w:right w:val="single" w:sz="5" w:space="0" w:color="000000"/>
             </w:tcBorders>
           </w:tcPr>
-          <w:p/>
+          <w:p>
+            <w:r>
+              <w:t>I developed live Labor-to-Sales analytics (/</w:t>
+            </w:r>
+            <w:proofErr w:type="spellStart"/>
+            <w:r>
+              <w:t>api</w:t>
+            </w:r>
+            <w:proofErr w:type="spellEnd"/>
+            <w:r>
+              <w:t>/</w:t>
+            </w:r>
+            <w:proofErr w:type="spellStart"/>
+            <w:r>
+              <w:t>hr</w:t>
+            </w:r>
+            <w:proofErr w:type="spellEnd"/>
+            <w:r>
+              <w:t>/labor-analytics), built the itemized Pay Stub Generator with CSV export, and added owner-configurable payroll and shift rules in Settings.</w:t>
+            </w:r>
+          </w:p>
         </w:tc>
         <w:tc>
           <w:tcPr>
@@ -18236,7 +19100,11 @@
               <w:right w:val="single" w:sz="5" w:space="0" w:color="000000"/>
             </w:tcBorders>
           </w:tcPr>
-          <w:p/>
+          <w:p>
+            <w:r>
+              <w:t>Providing live labor analytics and customizable overtime rules completed the platform's financial ERP suite.</w:t>
+            </w:r>
+          </w:p>
         </w:tc>
       </w:tr>
       <w:tr>
@@ -18320,7 +19188,11 @@
               <w:right w:val="single" w:sz="5" w:space="0" w:color="000000"/>
             </w:tcBorders>
           </w:tcPr>
-          <w:p/>
+          <w:p>
+            <w:r>
+              <w:t>I conducted final end-to-end user acceptance testing, completed project technical documentation, and finalized the industrial attachment handover with my field supervisor.</w:t>
+            </w:r>
+          </w:p>
         </w:tc>
         <w:tc>
           <w:tcPr>
@@ -18344,7 +19216,11 @@
               <w:right w:val="single" w:sz="5" w:space="0" w:color="000000"/>
             </w:tcBorders>
           </w:tcPr>
-          <w:p/>
+          <w:p>
+            <w:r>
+              <w:t>Concluding the project with full validation provided a satisfying finish to the attachment period.</w:t>
+            </w:r>
+          </w:p>
         </w:tc>
       </w:tr>
     </w:tbl>
@@ -18792,7 +19668,16 @@
           <w:sz w:val="22"/>
           <w:szCs w:val="22"/>
         </w:rPr>
-        <w:t>……</w:t>
+        <w:t>…</w:t>
+      </w:r>
+      <w:proofErr w:type="gramStart"/>
+      <w:r>
+        <w:rPr>
+          <w:rFonts w:ascii="Arial" w:eastAsia="Arial" w:hAnsi="Arial" w:cs="Arial"/>
+          <w:sz w:val="22"/>
+          <w:szCs w:val="22"/>
+        </w:rPr>
+        <w:t>…</w:t>
       </w:r>
       <w:r>
         <w:rPr>
@@ -18811,6 +19696,7 @@
         </w:rPr>
         <w:t>.</w:t>
       </w:r>
+      <w:proofErr w:type="gramEnd"/>
     </w:p>
     <w:p>
       <w:pPr>
@@ -18881,6 +19767,133 @@
           <w:szCs w:val="22"/>
         </w:rPr>
       </w:pPr>
+      <w:r>
+        <w:rPr>
+          <w:rFonts w:ascii="Arial" w:eastAsia="Arial" w:hAnsi="Arial" w:cs="Arial"/>
+          <w:b/>
+          <w:sz w:val="22"/>
+          <w:szCs w:val="22"/>
+        </w:rPr>
+        <w:t xml:space="preserve">In my final week of attachment, I completed the Time &amp; Attendance, Sales-Driven Compensation, Labor Analytics, and multi-branch management modules for </w:t>
+      </w:r>
+      <w:proofErr w:type="spellStart"/>
+      <w:r>
+        <w:rPr>
+          <w:rFonts w:ascii="Arial" w:eastAsia="Arial" w:hAnsi="Arial" w:cs="Arial"/>
+          <w:b/>
+          <w:sz w:val="22"/>
+          <w:szCs w:val="22"/>
+        </w:rPr>
+        <w:t>OpenFloat</w:t>
+      </w:r>
+      <w:proofErr w:type="spellEnd"/>
+      <w:r>
+        <w:rPr>
+          <w:rFonts w:ascii="Arial" w:eastAsia="Arial" w:hAnsi="Arial" w:cs="Arial"/>
+          <w:b/>
+          <w:sz w:val="22"/>
+          <w:szCs w:val="22"/>
+        </w:rPr>
+        <w:t xml:space="preserve"> POS X. I built the register terminal clock widget, replaced the legacy manual attendance system with automated shift tracking and differentials, implemented cashier sales commissions alongside statutory deductions (PAYE, NSSF, NHIF), and created live Labor-to-Sales analytics with an itemized Pay Stub Generator.</w:t>
+      </w:r>
+    </w:p>
+    <w:p>
+      <w:pPr>
+        <w:spacing w:before="24"/>
+        <w:ind w:left="600"/>
+        <w:rPr>
+          <w:rFonts w:ascii="Arial" w:eastAsia="Arial" w:hAnsi="Arial" w:cs="Arial"/>
+          <w:b/>
+          <w:sz w:val="22"/>
+          <w:szCs w:val="22"/>
+        </w:rPr>
+      </w:pPr>
+    </w:p>
+    <w:p>
+      <w:pPr>
+        <w:spacing w:before="24"/>
+        <w:ind w:left="600"/>
+        <w:rPr>
+          <w:rFonts w:ascii="Arial" w:eastAsia="Arial" w:hAnsi="Arial" w:cs="Arial"/>
+          <w:b/>
+          <w:sz w:val="22"/>
+          <w:szCs w:val="22"/>
+        </w:rPr>
+      </w:pPr>
+      <w:r>
+        <w:rPr>
+          <w:rFonts w:ascii="Arial" w:eastAsia="Arial" w:hAnsi="Arial" w:cs="Arial"/>
+          <w:b/>
+          <w:sz w:val="22"/>
+          <w:szCs w:val="22"/>
+        </w:rPr>
+        <w:t>I gained practical experience building advanced payroll engines, linking POS transaction attribution with commission payouts, and writing dynamic query aggregations for labor efficiency benchmarks. I also reinforced my knowledge of role-based security by restricting branch creation and overtime rule customization strictly to the Business Owner.</w:t>
+      </w:r>
+    </w:p>
+    <w:p>
+      <w:pPr>
+        <w:spacing w:before="24"/>
+        <w:ind w:left="600"/>
+        <w:rPr>
+          <w:rFonts w:ascii="Arial" w:eastAsia="Arial" w:hAnsi="Arial" w:cs="Arial"/>
+          <w:b/>
+          <w:sz w:val="22"/>
+          <w:szCs w:val="22"/>
+        </w:rPr>
+      </w:pPr>
+    </w:p>
+    <w:p>
+      <w:pPr>
+        <w:spacing w:before="24"/>
+        <w:ind w:left="600"/>
+        <w:rPr>
+          <w:rFonts w:ascii="Arial" w:eastAsia="Arial" w:hAnsi="Arial" w:cs="Arial"/>
+          <w:b/>
+          <w:sz w:val="22"/>
+          <w:szCs w:val="22"/>
+        </w:rPr>
+      </w:pPr>
+      <w:r>
+        <w:rPr>
+          <w:rFonts w:ascii="Arial" w:eastAsia="Arial" w:hAnsi="Arial" w:cs="Arial"/>
+          <w:b/>
+          <w:sz w:val="22"/>
+          <w:szCs w:val="22"/>
+        </w:rPr>
+        <w:t xml:space="preserve">A challenge I encountered on Wednesday was ensuring shift shortages and sales commissions calculated accurately across custom date ranges without double-counting transactions. I resolved this by scoping SQL aggregation queries strictly to the cashier's user ID and shift timestamps. On Saturday, I completed final system verification and successfully handed over the completed </w:t>
+      </w:r>
+      <w:proofErr w:type="spellStart"/>
+      <w:r>
+        <w:rPr>
+          <w:rFonts w:ascii="Arial" w:eastAsia="Arial" w:hAnsi="Arial" w:cs="Arial"/>
+          <w:b/>
+          <w:sz w:val="22"/>
+          <w:szCs w:val="22"/>
+        </w:rPr>
+        <w:t>OpenFloat</w:t>
+      </w:r>
+      <w:proofErr w:type="spellEnd"/>
+      <w:r>
+        <w:rPr>
+          <w:rFonts w:ascii="Arial" w:eastAsia="Arial" w:hAnsi="Arial" w:cs="Arial"/>
+          <w:b/>
+          <w:sz w:val="22"/>
+          <w:szCs w:val="22"/>
+        </w:rPr>
+        <w:t xml:space="preserve"> POS X platform to my field supervisor, concluding a rewarding 8-week industrial attachment.</w:t>
+      </w:r>
+    </w:p>
+    <w:p>
+      <w:pPr>
+        <w:spacing w:before="24"/>
+        <w:ind w:left="600"/>
+        <w:rPr>
+          <w:rFonts w:ascii="Arial" w:eastAsia="Arial" w:hAnsi="Arial" w:cs="Arial"/>
+          <w:b/>
+          <w:sz w:val="22"/>
+          <w:szCs w:val="22"/>
+        </w:rPr>
+      </w:pPr>
     </w:p>
     <w:p>
       <w:pPr>
@@ -19671,7 +20684,16 @@
           <w:sz w:val="22"/>
           <w:szCs w:val="22"/>
         </w:rPr>
-        <w:t>……</w:t>
+        <w:t>…</w:t>
+      </w:r>
+      <w:proofErr w:type="gramStart"/>
+      <w:r>
+        <w:rPr>
+          <w:rFonts w:ascii="Arial" w:eastAsia="Arial" w:hAnsi="Arial" w:cs="Arial"/>
+          <w:sz w:val="22"/>
+          <w:szCs w:val="22"/>
+        </w:rPr>
+        <w:t>…</w:t>
       </w:r>
       <w:r>
         <w:rPr>
@@ -19690,6 +20712,7 @@
         </w:rPr>
         <w:t>.</w:t>
       </w:r>
+      <w:proofErr w:type="gramEnd"/>
     </w:p>
     <w:p>
       <w:pPr>
@@ -19721,7 +20744,6 @@
           <w:szCs w:val="22"/>
           <w:u w:val="single"/>
         </w:rPr>
-        <w:lastRenderedPageBreak/>
         <w:t>TO BE FILLED BY UNIVERSITY SUPERVISOR ONLY</w:t>
       </w:r>
     </w:p>
@@ -21699,6 +22721,8 @@
   <w:rsids>
     <w:rsidRoot w:val="00AA1E3E"/>
     <w:rsid w:val="001B0D48"/>
+    <w:rsid w:val="00326D61"/>
+    <w:rsid w:val="00A24728"/>
     <w:rsid w:val="00AA1E3E"/>
     <w:rsid w:val="00AB6EC4"/>
     <w:rsid w:val="00B61AD3"/>

</xml_diff>